<commit_message>
aws-ec2 notes & code added
</commit_message>
<xml_diff>
--- a/Advanced Backend Part2 Self Notes.docx
+++ b/Advanced Backend Part2 Self Notes.docx
@@ -20,6 +20,73 @@
           <w:highlight w:val="yellow"/>
         </w:rPr>
         <w:t>Advance Backend Part 2</w:t>
+      </w:r>
+      <w:r>
+        <w:rPr>
+          <w:b/>
+          <w:bCs/>
+          <w:sz w:val="28"/>
+          <w:szCs w:val="28"/>
+        </w:rPr>
+        <w:t xml:space="preserve">  </w:t>
+      </w:r>
+      <w:r>
+        <w:rPr>
+          <w:b/>
+          <w:bCs/>
+          <w:sz w:val="16"/>
+          <w:szCs w:val="16"/>
+        </w:rPr>
+        <w:t xml:space="preserve">( </w:t>
+      </w:r>
+      <w:r>
+        <w:t>video link:</w:t>
+      </w:r>
+      <w:r>
+        <w:rPr>
+          <w:b/>
+          <w:bCs/>
+        </w:rPr>
+        <w:t xml:space="preserve"> </w:t>
+      </w:r>
+      <w:hyperlink r:id="rId5" w:history="1">
+        <w:r>
+          <w:rPr>
+            <w:rStyle w:val="Hyperlink"/>
+            <w:b/>
+            <w:bCs/>
+            <w:sz w:val="16"/>
+            <w:szCs w:val="16"/>
+          </w:rPr>
+          <w:t>https://youtu.be/lweDf3_q-sk?si=iZO3OwRu6-F_iq0A</w:t>
+        </w:r>
+      </w:hyperlink>
+      <w:r>
+        <w:rPr>
+          <w:b/>
+          <w:bCs/>
+          <w:sz w:val="16"/>
+          <w:szCs w:val="16"/>
+        </w:rPr>
+        <w:t xml:space="preserve"> </w:t>
+      </w:r>
+      <w:r>
+        <w:rPr>
+          <w:b/>
+          <w:bCs/>
+          <w:sz w:val="16"/>
+          <w:szCs w:val="16"/>
+        </w:rPr>
+        <w:t>(</w:t>
+      </w:r>
+      <w:r>
+        <w:rPr>
+          <w:b/>
+          <w:bCs/>
+          <w:sz w:val="16"/>
+          <w:szCs w:val="16"/>
+        </w:rPr>
+        <w:t>)</w:t>
       </w:r>
     </w:p>
     <w:p>
@@ -72,7 +139,7 @@
                     <pic:cNvPicPr/>
                   </pic:nvPicPr>
                   <pic:blipFill>
-                    <a:blip r:embed="rId5"/>
+                    <a:blip r:embed="rId6"/>
                     <a:stretch>
                       <a:fillRect/>
                     </a:stretch>
@@ -201,7 +268,7 @@
       <w:r>
         <w:t xml:space="preserve"> &amp; open ‘ </w:t>
       </w:r>
-      <w:hyperlink r:id="rId6" w:history="1">
+      <w:hyperlink r:id="rId7" w:history="1">
         <w:r>
           <w:rPr>
             <w:rStyle w:val="Hyperlink"/>
@@ -1466,7 +1533,7 @@
                     <pic:cNvPicPr/>
                   </pic:nvPicPr>
                   <pic:blipFill>
-                    <a:blip r:embed="rId7"/>
+                    <a:blip r:embed="rId8"/>
                     <a:stretch>
                       <a:fillRect/>
                     </a:stretch>
@@ -1506,7 +1573,7 @@
                     <pic:cNvPicPr/>
                   </pic:nvPicPr>
                   <pic:blipFill>
-                    <a:blip r:embed="rId8"/>
+                    <a:blip r:embed="rId9"/>
                     <a:stretch>
                       <a:fillRect/>
                     </a:stretch>
@@ -1548,7 +1615,7 @@
                     <pic:cNvPicPr/>
                   </pic:nvPicPr>
                   <pic:blipFill>
-                    <a:blip r:embed="rId9"/>
+                    <a:blip r:embed="rId10"/>
                     <a:stretch>
                       <a:fillRect/>
                     </a:stretch>
@@ -1588,7 +1655,7 @@
                     <pic:cNvPicPr/>
                   </pic:nvPicPr>
                   <pic:blipFill rotWithShape="1">
-                    <a:blip r:embed="rId10"/>
+                    <a:blip r:embed="rId11"/>
                     <a:srcRect r="6811"/>
                     <a:stretch>
                       <a:fillRect/>
@@ -1639,7 +1706,7 @@
                     <pic:cNvPicPr/>
                   </pic:nvPicPr>
                   <pic:blipFill>
-                    <a:blip r:embed="rId11"/>
+                    <a:blip r:embed="rId12"/>
                     <a:stretch>
                       <a:fillRect/>
                     </a:stretch>
@@ -1679,7 +1746,7 @@
                     <pic:cNvPicPr/>
                   </pic:nvPicPr>
                   <pic:blipFill>
-                    <a:blip r:embed="rId12"/>
+                    <a:blip r:embed="rId13"/>
                     <a:stretch>
                       <a:fillRect/>
                     </a:stretch>
@@ -1736,7 +1803,7 @@
         </w:rPr>
         <w:t xml:space="preserve"> </w:t>
       </w:r>
-      <w:hyperlink r:id="rId13" w:history="1">
+      <w:hyperlink r:id="rId14" w:history="1">
         <w:r>
           <w:rPr>
             <w:rStyle w:val="Hyperlink"/>
@@ -4464,7 +4531,7 @@
                     <pic:cNvPicPr/>
                   </pic:nvPicPr>
                   <pic:blipFill>
-                    <a:blip r:embed="rId14"/>
+                    <a:blip r:embed="rId15"/>
                     <a:stretch>
                       <a:fillRect/>
                     </a:stretch>
@@ -9105,7 +9172,7 @@
       <w:r>
         <w:br/>
       </w:r>
-      <w:hyperlink r:id="rId15" w:history="1">
+      <w:hyperlink r:id="rId16" w:history="1">
         <w:r>
           <w:rPr>
             <w:rStyle w:val="Hyperlink"/>
@@ -9125,7 +9192,7 @@
         <w:br/>
         <w:t xml:space="preserve">create tavily api-key: </w:t>
       </w:r>
-      <w:hyperlink r:id="rId16" w:history="1">
+      <w:hyperlink r:id="rId17" w:history="1">
         <w:r>
           <w:rPr>
             <w:rStyle w:val="Hyperlink"/>
@@ -22515,7 +22582,7 @@
         </w:rPr>
         <w:t xml:space="preserve">Note: hm ny koi chezein hawa ma nhe chorien… ya sb implementation documentation ma likhi hoi hn. </w:t>
       </w:r>
-      <w:hyperlink r:id="rId17" w:history="1">
+      <w:hyperlink r:id="rId18" w:history="1">
         <w:r>
           <w:rPr>
             <w:rStyle w:val="Hyperlink"/>
@@ -22612,7 +22679,7 @@
                     <pic:cNvPicPr/>
                   </pic:nvPicPr>
                   <pic:blipFill>
-                    <a:blip r:embed="rId18"/>
+                    <a:blip r:embed="rId19"/>
                     <a:stretch>
                       <a:fillRect/>
                     </a:stretch>
@@ -23078,7 +23145,7 @@
                     <pic:cNvPicPr/>
                   </pic:nvPicPr>
                   <pic:blipFill>
-                    <a:blip r:embed="rId19"/>
+                    <a:blip r:embed="rId20"/>
                     <a:stretch>
                       <a:fillRect/>
                     </a:stretch>
@@ -23136,7 +23203,7 @@
                     <pic:cNvPicPr/>
                   </pic:nvPicPr>
                   <pic:blipFill>
-                    <a:blip r:embed="rId20"/>
+                    <a:blip r:embed="rId21"/>
                     <a:stretch>
                       <a:fillRect/>
                     </a:stretch>
@@ -23187,7 +23254,7 @@
                     <pic:cNvPicPr/>
                   </pic:nvPicPr>
                   <pic:blipFill rotWithShape="1">
-                    <a:blip r:embed="rId21"/>
+                    <a:blip r:embed="rId22"/>
                     <a:srcRect r="47355"/>
                     <a:stretch>
                       <a:fillRect/>
@@ -23241,7 +23308,7 @@
                     <pic:cNvPicPr/>
                   </pic:nvPicPr>
                   <pic:blipFill rotWithShape="1">
-                    <a:blip r:embed="rId21"/>
+                    <a:blip r:embed="rId22"/>
                     <a:srcRect l="75546"/>
                     <a:stretch>
                       <a:fillRect/>
@@ -23309,7 +23376,7 @@
                     <pic:cNvPicPr/>
                   </pic:nvPicPr>
                   <pic:blipFill>
-                    <a:blip r:embed="rId22"/>
+                    <a:blip r:embed="rId23"/>
                     <a:stretch>
                       <a:fillRect/>
                     </a:stretch>
@@ -23354,7 +23421,7 @@
                     <pic:cNvPicPr/>
                   </pic:nvPicPr>
                   <pic:blipFill rotWithShape="1">
-                    <a:blip r:embed="rId23"/>
+                    <a:blip r:embed="rId24"/>
                     <a:srcRect r="54746"/>
                     <a:stretch>
                       <a:fillRect/>
@@ -23408,7 +23475,7 @@
                     <pic:cNvPicPr/>
                   </pic:nvPicPr>
                   <pic:blipFill rotWithShape="1">
-                    <a:blip r:embed="rId23"/>
+                    <a:blip r:embed="rId24"/>
                     <a:srcRect l="75344"/>
                     <a:stretch>
                       <a:fillRect/>
@@ -23488,7 +23555,7 @@
                     <pic:cNvPicPr/>
                   </pic:nvPicPr>
                   <pic:blipFill>
-                    <a:blip r:embed="rId24"/>
+                    <a:blip r:embed="rId25"/>
                     <a:stretch>
                       <a:fillRect/>
                     </a:stretch>
@@ -23919,7 +23986,7 @@
         </w:rPr>
         <w:br/>
       </w:r>
-      <w:hyperlink r:id="rId25" w:history="1">
+      <w:hyperlink r:id="rId26" w:history="1">
         <w:r>
           <w:rPr>
             <w:rStyle w:val="Hyperlink"/>
@@ -24050,7 +24117,7 @@
         </w:rPr>
         <w:br/>
       </w:r>
-      <w:hyperlink r:id="rId26" w:history="1">
+      <w:hyperlink r:id="rId27" w:history="1">
         <w:r>
           <w:rPr>
             <w:rStyle w:val="Hyperlink"/>
@@ -24201,7 +24268,7 @@
                     <pic:cNvPicPr/>
                   </pic:nvPicPr>
                   <pic:blipFill>
-                    <a:blip r:embed="rId27"/>
+                    <a:blip r:embed="rId28"/>
                     <a:stretch>
                       <a:fillRect/>
                     </a:stretch>
@@ -29840,7 +29907,7 @@
                     <pic:cNvPicPr/>
                   </pic:nvPicPr>
                   <pic:blipFill>
-                    <a:blip r:embed="rId28"/>
+                    <a:blip r:embed="rId29"/>
                     <a:stretch>
                       <a:fillRect/>
                     </a:stretch>
@@ -31550,7 +31617,17 @@
           <w:szCs w:val="21"/>
           <w14:ligatures w14:val="none"/>
         </w:rPr>
-        <w:t xml:space="preserve">====================== </w:t>
+        <w:t xml:space="preserve">=================== </w:t>
+      </w:r>
+      <w:r>
+        <w:rPr>
+          <w:rFonts w:ascii="Consolas" w:eastAsia="Times New Roman" w:hAnsi="Consolas" w:cs="Times New Roman"/>
+          <w:kern w:val="0"/>
+          <w:sz w:val="21"/>
+          <w:szCs w:val="21"/>
+          <w14:ligatures w14:val="none"/>
+        </w:rPr>
+        <w:t xml:space="preserve">level 5/ </w:t>
       </w:r>
       <w:r>
         <w:rPr>
@@ -31566,13 +31643,25 @@
       </w:r>
       <w:r>
         <w:rPr>
-          <w:rFonts w:ascii="Consolas" w:eastAsia="Times New Roman" w:hAnsi="Consolas" w:cs="Times New Roman"/>
-          <w:kern w:val="0"/>
-          <w:sz w:val="21"/>
-          <w:szCs w:val="21"/>
-          <w14:ligatures w14:val="none"/>
-        </w:rPr>
-        <w:t>===========================</w:t>
+          <w:rFonts w:ascii="Montserrat Black" w:eastAsia="Times New Roman" w:hAnsi="Montserrat Black" w:cs="Times New Roman"/>
+          <w:b/>
+          <w:bCs/>
+          <w:kern w:val="0"/>
+          <w:sz w:val="24"/>
+          <w:szCs w:val="24"/>
+          <w14:ligatures w14:val="none"/>
+        </w:rPr>
+        <w:t xml:space="preserve"> </w:t>
+      </w:r>
+      <w:r>
+        <w:rPr>
+          <w:rFonts w:ascii="Consolas" w:eastAsia="Times New Roman" w:hAnsi="Consolas" w:cs="Times New Roman"/>
+          <w:kern w:val="0"/>
+          <w:sz w:val="21"/>
+          <w:szCs w:val="21"/>
+          <w14:ligatures w14:val="none"/>
+        </w:rPr>
+        <w:t>=======================</w:t>
       </w:r>
     </w:p>
     <w:p>
@@ -31623,7 +31712,7 @@
                     <pic:cNvPicPr/>
                   </pic:nvPicPr>
                   <pic:blipFill>
-                    <a:blip r:embed="rId29"/>
+                    <a:blip r:embed="rId30"/>
                     <a:stretch>
                       <a:fillRect/>
                     </a:stretch>
@@ -31680,7 +31769,7 @@
                     <pic:cNvPicPr/>
                   </pic:nvPicPr>
                   <pic:blipFill>
-                    <a:blip r:embed="rId30"/>
+                    <a:blip r:embed="rId31"/>
                     <a:stretch>
                       <a:fillRect/>
                     </a:stretch>
@@ -31712,6 +31801,18 @@
           <w14:ligatures w14:val="none"/>
         </w:rPr>
       </w:pPr>
+    </w:p>
+    <w:p>
+      <w:pPr>
+        <w:spacing w:after="0" w:line="285" w:lineRule="atLeast"/>
+        <w:rPr>
+          <w:rFonts w:ascii="Consolas" w:eastAsia="Times New Roman" w:hAnsi="Consolas" w:cs="Times New Roman"/>
+          <w:kern w:val="0"/>
+          <w:sz w:val="21"/>
+          <w:szCs w:val="21"/>
+          <w14:ligatures w14:val="none"/>
+        </w:rPr>
+      </w:pPr>
       <w:r>
         <w:rPr>
           <w:rFonts w:ascii="Consolas" w:eastAsia="Times New Roman" w:hAnsi="Consolas" w:cs="Times New Roman"/>
@@ -31760,6 +31861,149 @@
         <w:tab/>
         <w:t>//control access</w:t>
       </w:r>
+      <w:r>
+        <w:rPr>
+          <w:rFonts w:ascii="Consolas" w:eastAsia="Times New Roman" w:hAnsi="Consolas" w:cs="Times New Roman"/>
+          <w:kern w:val="0"/>
+          <w:sz w:val="21"/>
+          <w:szCs w:val="21"/>
+          <w14:ligatures w14:val="none"/>
+        </w:rPr>
+        <w:t xml:space="preserve"> //IAM users – create user – enter username &amp;  next – give permission from directly add policies: serch &amp; checked EC2 &amp; S3 full access </w:t>
+      </w:r>
+      <w:r>
+        <w:rPr>
+          <w:rFonts w:ascii="Consolas" w:eastAsia="Times New Roman" w:hAnsi="Consolas" w:cs="Times New Roman"/>
+          <w:kern w:val="0"/>
+          <w:sz w:val="21"/>
+          <w:szCs w:val="21"/>
+          <w14:ligatures w14:val="none"/>
+        </w:rPr>
+        <w:t>&amp; next –</w:t>
+      </w:r>
+      <w:r>
+        <w:rPr>
+          <w:rFonts w:ascii="Consolas" w:eastAsia="Times New Roman" w:hAnsi="Consolas" w:cs="Times New Roman"/>
+          <w:kern w:val="0"/>
+          <w:sz w:val="21"/>
+          <w:szCs w:val="21"/>
+          <w14:ligatures w14:val="none"/>
+        </w:rPr>
+        <w:t xml:space="preserve"> </w:t>
+      </w:r>
+      <w:r>
+        <w:rPr>
+          <w:rFonts w:ascii="Consolas" w:eastAsia="Times New Roman" w:hAnsi="Consolas" w:cs="Times New Roman"/>
+          <w:kern w:val="0"/>
+          <w:sz w:val="21"/>
+          <w:szCs w:val="21"/>
+          <w14:ligatures w14:val="none"/>
+        </w:rPr>
+        <w:t>create user</w:t>
+      </w:r>
+      <w:r>
+        <w:rPr>
+          <w:rFonts w:ascii="Consolas" w:eastAsia="Times New Roman" w:hAnsi="Consolas" w:cs="Times New Roman"/>
+          <w:kern w:val="0"/>
+          <w:sz w:val="21"/>
+          <w:szCs w:val="21"/>
+          <w14:ligatures w14:val="none"/>
+        </w:rPr>
+        <w:t xml:space="preserve"> – open specific user &amp; goto its security credential tab &amp; enable console access by set</w:t>
+      </w:r>
+      <w:r>
+        <w:rPr>
+          <w:rFonts w:ascii="Consolas" w:eastAsia="Times New Roman" w:hAnsi="Consolas" w:cs="Times New Roman"/>
+          <w:kern w:val="0"/>
+          <w:sz w:val="21"/>
+          <w:szCs w:val="21"/>
+          <w14:ligatures w14:val="none"/>
+        </w:rPr>
+        <w:t xml:space="preserve"> custom</w:t>
+      </w:r>
+      <w:r>
+        <w:rPr>
+          <w:rFonts w:ascii="Consolas" w:eastAsia="Times New Roman" w:hAnsi="Consolas" w:cs="Times New Roman"/>
+          <w:kern w:val="0"/>
+          <w:sz w:val="21"/>
+          <w:szCs w:val="21"/>
+          <w14:ligatures w14:val="none"/>
+        </w:rPr>
+        <w:t xml:space="preserve"> password </w:t>
+      </w:r>
+      <w:r>
+        <w:rPr>
+          <w:rFonts w:ascii="Consolas" w:eastAsia="Times New Roman" w:hAnsi="Consolas" w:cs="Times New Roman"/>
+          <w:kern w:val="0"/>
+          <w:sz w:val="21"/>
+          <w:szCs w:val="21"/>
+          <w14:ligatures w14:val="none"/>
+        </w:rPr>
+        <w:t>&amp; all done</w:t>
+      </w:r>
+      <w:r>
+        <w:rPr>
+          <w:rFonts w:ascii="Consolas" w:eastAsia="Times New Roman" w:hAnsi="Consolas" w:cs="Times New Roman"/>
+          <w:kern w:val="0"/>
+          <w:sz w:val="21"/>
+          <w:szCs w:val="21"/>
+          <w14:ligatures w14:val="none"/>
+        </w:rPr>
+        <w:t>.</w:t>
+      </w:r>
+    </w:p>
+    <w:p>
+      <w:pPr>
+        <w:pStyle w:val="ListParagraph"/>
+        <w:spacing w:after="0" w:line="285" w:lineRule="atLeast"/>
+        <w:rPr>
+          <w:rFonts w:ascii="Consolas" w:eastAsia="Times New Roman" w:hAnsi="Consolas" w:cs="Times New Roman"/>
+          <w:kern w:val="0"/>
+          <w:sz w:val="21"/>
+          <w:szCs w:val="21"/>
+          <w14:ligatures w14:val="none"/>
+        </w:rPr>
+      </w:pPr>
+      <w:r>
+        <w:rPr>
+          <w:rFonts w:ascii="Consolas" w:eastAsia="Times New Roman" w:hAnsi="Consolas" w:cs="Times New Roman"/>
+          <w:kern w:val="0"/>
+          <w:sz w:val="21"/>
+          <w:szCs w:val="21"/>
+          <w14:ligatures w14:val="none"/>
+        </w:rPr>
+        <w:t xml:space="preserve">Now </w:t>
+      </w:r>
+      <w:r>
+        <w:rPr>
+          <w:rFonts w:ascii="Consolas" w:eastAsia="Times New Roman" w:hAnsi="Consolas" w:cs="Times New Roman"/>
+          <w:kern w:val="0"/>
+          <w:sz w:val="21"/>
+          <w:szCs w:val="21"/>
+          <w14:ligatures w14:val="none"/>
+        </w:rPr>
+        <w:t>login use new IAM user cridentials in another brower</w:t>
+      </w:r>
+      <w:r>
+        <w:rPr>
+          <w:rFonts w:ascii="Consolas" w:eastAsia="Times New Roman" w:hAnsi="Consolas" w:cs="Times New Roman"/>
+          <w:kern w:val="0"/>
+          <w:sz w:val="21"/>
+          <w:szCs w:val="21"/>
+          <w14:ligatures w14:val="none"/>
+        </w:rPr>
+        <w:t xml:space="preserve"> for testing</w:t>
+      </w:r>
+      <w:r>
+        <w:rPr>
+          <w:rFonts w:ascii="Consolas" w:eastAsia="Times New Roman" w:hAnsi="Consolas" w:cs="Times New Roman"/>
+          <w:kern w:val="0"/>
+          <w:sz w:val="21"/>
+          <w:szCs w:val="21"/>
+          <w14:ligatures w14:val="none"/>
+        </w:rPr>
+        <w:t xml:space="preserve"> &amp; then root user delete this user.</w:t>
+      </w:r>
     </w:p>
     <w:p>
       <w:pPr>
@@ -31802,6 +32046,19 @@
     <w:p>
       <w:pPr>
         <w:pStyle w:val="ListParagraph"/>
+        <w:spacing w:after="0" w:line="285" w:lineRule="atLeast"/>
+        <w:rPr>
+          <w:rFonts w:ascii="Consolas" w:eastAsia="Times New Roman" w:hAnsi="Consolas" w:cs="Times New Roman"/>
+          <w:kern w:val="0"/>
+          <w:sz w:val="21"/>
+          <w:szCs w:val="21"/>
+          <w14:ligatures w14:val="none"/>
+        </w:rPr>
+      </w:pPr>
+    </w:p>
+    <w:p>
+      <w:pPr>
+        <w:pStyle w:val="ListParagraph"/>
         <w:numPr>
           <w:ilvl w:val="0"/>
           <w:numId w:val="5"/>
@@ -31823,6 +32080,7 @@
           <w:szCs w:val="21"/>
           <w14:ligatures w14:val="none"/>
         </w:rPr>
+        <w:lastRenderedPageBreak/>
         <w:t>EC2</w:t>
       </w:r>
       <w:r>
@@ -31908,16 +32166,27 @@
           <w14:ligatures w14:val="none"/>
         </w:rPr>
         <w:br/>
-      </w:r>
-      <w:r>
-        <w:rPr>
-          <w:rFonts w:ascii="Consolas" w:eastAsia="Times New Roman" w:hAnsi="Consolas" w:cs="Times New Roman"/>
-          <w:kern w:val="0"/>
-          <w:sz w:val="21"/>
-          <w:szCs w:val="21"/>
-          <w14:ligatures w14:val="none"/>
-        </w:rPr>
-        <w:t>create &amp; assign elastic ip to instance – connect server to local cmd through SSH key-pair &amp; connect cmd</w:t>
+        <w:t>create &amp; assign elastic ip to instance</w:t>
+      </w:r>
+      <w:r>
+        <w:rPr>
+          <w:rFonts w:ascii="Consolas" w:eastAsia="Times New Roman" w:hAnsi="Consolas" w:cs="Times New Roman"/>
+          <w:kern w:val="0"/>
+          <w:sz w:val="21"/>
+          <w:szCs w:val="21"/>
+          <w14:ligatures w14:val="none"/>
+        </w:rPr>
+        <w:t xml:space="preserve"> in aws</w:t>
+      </w:r>
+      <w:r>
+        <w:rPr>
+          <w:rFonts w:ascii="Consolas" w:eastAsia="Times New Roman" w:hAnsi="Consolas" w:cs="Times New Roman"/>
+          <w:kern w:val="0"/>
+          <w:sz w:val="21"/>
+          <w:szCs w:val="21"/>
+          <w14:ligatures w14:val="none"/>
+        </w:rPr>
+        <w:t xml:space="preserve"> – connect server to local cmd through SSH key-pair &amp; connect cmd</w:t>
       </w:r>
       <w:r>
         <w:rPr>
@@ -31957,7 +32226,103 @@
           <w:szCs w:val="21"/>
           <w14:ligatures w14:val="none"/>
         </w:rPr>
-        <w:t>pull repo to server – install docker &amp; create and run docker container – add port to instance security group</w:t>
+        <w:t xml:space="preserve">pull repo to server – install </w:t>
+      </w:r>
+      <w:r>
+        <w:rPr>
+          <w:rFonts w:ascii="Consolas" w:eastAsia="Times New Roman" w:hAnsi="Consolas" w:cs="Times New Roman"/>
+          <w:b/>
+          <w:bCs/>
+          <w:kern w:val="0"/>
+          <w:sz w:val="21"/>
+          <w:szCs w:val="21"/>
+          <w14:ligatures w14:val="none"/>
+        </w:rPr>
+        <w:t>docker</w:t>
+      </w:r>
+      <w:r>
+        <w:rPr>
+          <w:rFonts w:ascii="Consolas" w:eastAsia="Times New Roman" w:hAnsi="Consolas" w:cs="Times New Roman"/>
+          <w:b/>
+          <w:bCs/>
+          <w:kern w:val="0"/>
+          <w:sz w:val="21"/>
+          <w:szCs w:val="21"/>
+          <w14:ligatures w14:val="none"/>
+        </w:rPr>
+        <w:t xml:space="preserve"> on ubuntu server</w:t>
+      </w:r>
+      <w:r>
+        <w:rPr>
+          <w:rFonts w:ascii="Consolas" w:eastAsia="Times New Roman" w:hAnsi="Consolas" w:cs="Times New Roman"/>
+          <w:kern w:val="0"/>
+          <w:sz w:val="21"/>
+          <w:szCs w:val="21"/>
+          <w14:ligatures w14:val="none"/>
+        </w:rPr>
+        <w:t xml:space="preserve"> (i.e serach</w:t>
+      </w:r>
+      <w:r>
+        <w:rPr>
+          <w:rFonts w:ascii="Consolas" w:eastAsia="Times New Roman" w:hAnsi="Consolas" w:cs="Times New Roman"/>
+          <w:kern w:val="0"/>
+          <w:sz w:val="21"/>
+          <w:szCs w:val="21"/>
+          <w14:ligatures w14:val="none"/>
+        </w:rPr>
+        <w:t xml:space="preserve"> google:</w:t>
+      </w:r>
+      <w:r>
+        <w:rPr>
+          <w:rFonts w:ascii="Consolas" w:eastAsia="Times New Roman" w:hAnsi="Consolas" w:cs="Times New Roman"/>
+          <w:kern w:val="0"/>
+          <w:sz w:val="21"/>
+          <w:szCs w:val="21"/>
+          <w14:ligatures w14:val="none"/>
+        </w:rPr>
+        <w:t xml:space="preserve"> install docker on ubuntu)</w:t>
+      </w:r>
+      <w:r>
+        <w:rPr>
+          <w:rFonts w:ascii="Consolas" w:eastAsia="Times New Roman" w:hAnsi="Consolas" w:cs="Times New Roman"/>
+          <w:kern w:val="0"/>
+          <w:sz w:val="21"/>
+          <w:szCs w:val="21"/>
+          <w14:ligatures w14:val="none"/>
+        </w:rPr>
+        <w:t xml:space="preserve"> &amp; create</w:t>
+      </w:r>
+      <w:r>
+        <w:rPr>
+          <w:rFonts w:ascii="Consolas" w:eastAsia="Times New Roman" w:hAnsi="Consolas" w:cs="Times New Roman"/>
+          <w:kern w:val="0"/>
+          <w:sz w:val="21"/>
+          <w:szCs w:val="21"/>
+          <w14:ligatures w14:val="none"/>
+        </w:rPr>
+        <w:t xml:space="preserve"> dockerImage</w:t>
+      </w:r>
+      <w:r>
+        <w:rPr>
+          <w:rFonts w:ascii="Consolas" w:eastAsia="Times New Roman" w:hAnsi="Consolas" w:cs="Times New Roman"/>
+          <w:kern w:val="0"/>
+          <w:sz w:val="21"/>
+          <w:szCs w:val="21"/>
+          <w14:ligatures w14:val="none"/>
+        </w:rPr>
+        <w:t xml:space="preserve"> and run docker container – </w:t>
+      </w:r>
+      <w:r>
+        <w:rPr>
+          <w:rFonts w:ascii="Consolas" w:eastAsia="Times New Roman" w:hAnsi="Consolas" w:cs="Times New Roman"/>
+          <w:b/>
+          <w:bCs/>
+          <w:kern w:val="0"/>
+          <w:sz w:val="21"/>
+          <w:szCs w:val="21"/>
+          <w14:ligatures w14:val="none"/>
+        </w:rPr>
+        <w:t>add port to instance security group</w:t>
       </w:r>
       <w:r>
         <w:rPr>
@@ -31969,7 +32334,7 @@
         </w:rPr>
         <w:t xml:space="preserve"> – access server on </w:t>
       </w:r>
-      <w:hyperlink r:id="rId31" w:history="1">
+      <w:hyperlink r:id="rId32" w:history="1">
         <w:r>
           <w:rPr>
             <w:rStyle w:val="Hyperlink"/>
@@ -32010,47 +32375,6 @@
           <w:szCs w:val="21"/>
           <w14:ligatures w14:val="none"/>
         </w:rPr>
-        <w:lastRenderedPageBreak/>
-        <w:t xml:space="preserve">EC2 – instances – launch instances – server_name – QuickStart (Ubuntu ) – instanceType – create-key-pair-for-login &amp; save it in localDist c:/users/pc – allow SSH traffic from 0.0.0.0/0 </w:t>
-      </w:r>
-      <w:r>
-        <w:rPr>
-          <w:rFonts w:ascii="Consolas" w:eastAsia="Times New Roman" w:hAnsi="Consolas" w:cs="Times New Roman"/>
-          <w:kern w:val="0"/>
-          <w:sz w:val="21"/>
-          <w:szCs w:val="21"/>
-          <w14:ligatures w14:val="none"/>
-        </w:rPr>
-        <w:t xml:space="preserve"> //so we control server from our local pc. --- </w:t>
-      </w:r>
-      <w:r>
-        <w:rPr>
-          <w:rFonts w:ascii="Consolas" w:eastAsia="Times New Roman" w:hAnsi="Consolas" w:cs="Times New Roman"/>
-          <w:kern w:val="0"/>
-          <w:sz w:val="21"/>
-          <w:szCs w:val="21"/>
-          <w14:ligatures w14:val="none"/>
-        </w:rPr>
-        <w:t>launch</w:t>
-      </w:r>
-      <w:r>
-        <w:rPr>
-          <w:rFonts w:ascii="Consolas" w:eastAsia="Times New Roman" w:hAnsi="Consolas" w:cs="Times New Roman"/>
-          <w:kern w:val="0"/>
-          <w:sz w:val="21"/>
-          <w:szCs w:val="21"/>
-          <w14:ligatures w14:val="none"/>
-        </w:rPr>
-        <w:t xml:space="preserve"> Instance</w:t>
-      </w:r>
-      <w:r>
-        <w:rPr>
-          <w:rFonts w:ascii="Consolas" w:eastAsia="Times New Roman" w:hAnsi="Consolas" w:cs="Times New Roman"/>
-          <w:kern w:val="0"/>
-          <w:sz w:val="21"/>
-          <w:szCs w:val="21"/>
-          <w14:ligatures w14:val="none"/>
-        </w:rPr>
         <w:br/>
       </w:r>
       <w:r>
@@ -32061,26 +32385,103 @@
           <w:szCs w:val="21"/>
           <w14:ligatures w14:val="none"/>
         </w:rPr>
-        <w:br/>
-        <w:t xml:space="preserve">EC2 – </w:t>
+        <w:t>1</w:t>
+      </w:r>
+      <w:r>
+        <w:rPr>
+          <w:rFonts w:ascii="Consolas" w:eastAsia="Times New Roman" w:hAnsi="Consolas" w:cs="Times New Roman"/>
+          <w:kern w:val="0"/>
+          <w:sz w:val="21"/>
+          <w:szCs w:val="21"/>
+          <w14:ligatures w14:val="none"/>
+        </w:rPr>
+        <w:t xml:space="preserve">&gt; </w:t>
+      </w:r>
+      <w:r>
+        <w:rPr>
+          <w:rFonts w:ascii="Consolas" w:eastAsia="Times New Roman" w:hAnsi="Consolas" w:cs="Times New Roman"/>
+          <w:kern w:val="0"/>
+          <w:sz w:val="21"/>
+          <w:szCs w:val="21"/>
+          <w14:ligatures w14:val="none"/>
+        </w:rPr>
+        <w:t xml:space="preserve">EC2 – instances – </w:t>
       </w:r>
       <w:r>
         <w:rPr>
           <w:rFonts w:ascii="Consolas" w:eastAsia="Times New Roman" w:hAnsi="Consolas" w:cs="Times New Roman"/>
           <w:b/>
           <w:bCs/>
-          <w:color w:val="EE0000"/>
-          <w:kern w:val="0"/>
-          <w:sz w:val="21"/>
-          <w:szCs w:val="21"/>
-          <w14:ligatures w14:val="none"/>
-        </w:rPr>
-        <w:t>elastic Ips</w:t>
-      </w:r>
-      <w:r>
-        <w:rPr>
-          <w:rFonts w:ascii="Consolas" w:eastAsia="Times New Roman" w:hAnsi="Consolas" w:cs="Times New Roman"/>
-          <w:color w:val="EE0000"/>
+          <w:kern w:val="0"/>
+          <w:sz w:val="21"/>
+          <w:szCs w:val="21"/>
+          <w14:ligatures w14:val="none"/>
+        </w:rPr>
+        <w:t>launch instances</w:t>
+      </w:r>
+      <w:r>
+        <w:rPr>
+          <w:rFonts w:ascii="Consolas" w:eastAsia="Times New Roman" w:hAnsi="Consolas" w:cs="Times New Roman"/>
+          <w:kern w:val="0"/>
+          <w:sz w:val="21"/>
+          <w:szCs w:val="21"/>
+          <w14:ligatures w14:val="none"/>
+        </w:rPr>
+        <w:t xml:space="preserve"> – server_name – QuickStart (Ubuntu ) – instanceType</w:t>
+      </w:r>
+      <w:r>
+        <w:rPr>
+          <w:rFonts w:ascii="Consolas" w:eastAsia="Times New Roman" w:hAnsi="Consolas" w:cs="Times New Roman"/>
+          <w:kern w:val="0"/>
+          <w:sz w:val="21"/>
+          <w:szCs w:val="21"/>
+          <w14:ligatures w14:val="none"/>
+        </w:rPr>
+        <w:t xml:space="preserve"> (2,4gb ram etc</w:t>
+      </w:r>
+      <w:r>
+        <w:rPr>
+          <w:rFonts w:ascii="Consolas" w:eastAsia="Times New Roman" w:hAnsi="Consolas" w:cs="Times New Roman"/>
+          <w:kern w:val="0"/>
+          <w:sz w:val="21"/>
+          <w:szCs w:val="21"/>
+          <w14:ligatures w14:val="none"/>
+        </w:rPr>
+        <w:t xml:space="preserve"> machine</w:t>
+      </w:r>
+      <w:r>
+        <w:rPr>
+          <w:rFonts w:ascii="Consolas" w:eastAsia="Times New Roman" w:hAnsi="Consolas" w:cs="Times New Roman"/>
+          <w:kern w:val="0"/>
+          <w:sz w:val="21"/>
+          <w:szCs w:val="21"/>
+          <w14:ligatures w14:val="none"/>
+        </w:rPr>
+        <w:t>)</w:t>
+      </w:r>
+      <w:r>
+        <w:rPr>
+          <w:rFonts w:ascii="Consolas" w:eastAsia="Times New Roman" w:hAnsi="Consolas" w:cs="Times New Roman"/>
+          <w:kern w:val="0"/>
+          <w:sz w:val="21"/>
+          <w:szCs w:val="21"/>
+          <w14:ligatures w14:val="none"/>
+        </w:rPr>
+        <w:t xml:space="preserve"> – create-key-pair-for-login</w:t>
+      </w:r>
+      <w:r>
+        <w:rPr>
+          <w:rFonts w:ascii="Consolas" w:eastAsia="Times New Roman" w:hAnsi="Consolas" w:cs="Times New Roman"/>
+          <w:kern w:val="0"/>
+          <w:sz w:val="21"/>
+          <w:szCs w:val="21"/>
+          <w14:ligatures w14:val="none"/>
+        </w:rPr>
+        <w:t xml:space="preserve"> with name ‘level5kp’</w:t>
+      </w:r>
+      <w:r>
+        <w:rPr>
+          <w:rFonts w:ascii="Consolas" w:eastAsia="Times New Roman" w:hAnsi="Consolas" w:cs="Times New Roman"/>
           <w:kern w:val="0"/>
           <w:sz w:val="21"/>
           <w:szCs w:val="21"/>
@@ -32096,7 +32497,243 @@
           <w:szCs w:val="21"/>
           <w14:ligatures w14:val="none"/>
         </w:rPr>
-        <w:t>– allocate elastic ip.</w:t>
+        <w:t>and</w:t>
+      </w:r>
+      <w:r>
+        <w:rPr>
+          <w:rFonts w:ascii="Consolas" w:eastAsia="Times New Roman" w:hAnsi="Consolas" w:cs="Times New Roman"/>
+          <w:kern w:val="0"/>
+          <w:sz w:val="21"/>
+          <w:szCs w:val="21"/>
+          <w14:ligatures w14:val="none"/>
+        </w:rPr>
+        <w:t xml:space="preserve"> save it in localDist</w:t>
+      </w:r>
+      <w:r>
+        <w:rPr>
+          <w:rFonts w:ascii="Consolas" w:eastAsia="Times New Roman" w:hAnsi="Consolas" w:cs="Times New Roman"/>
+          <w:kern w:val="0"/>
+          <w:sz w:val="21"/>
+          <w:szCs w:val="21"/>
+          <w14:ligatures w14:val="none"/>
+        </w:rPr>
+        <w:t xml:space="preserve"> path</w:t>
+      </w:r>
+      <w:r>
+        <w:rPr>
+          <w:rFonts w:ascii="Consolas" w:eastAsia="Times New Roman" w:hAnsi="Consolas" w:cs="Times New Roman"/>
+          <w:kern w:val="0"/>
+          <w:sz w:val="21"/>
+          <w:szCs w:val="21"/>
+          <w14:ligatures w14:val="none"/>
+        </w:rPr>
+        <w:t xml:space="preserve"> </w:t>
+      </w:r>
+      <w:r>
+        <w:rPr>
+          <w:rFonts w:ascii="Consolas" w:eastAsia="Times New Roman" w:hAnsi="Consolas" w:cs="Times New Roman"/>
+          <w:kern w:val="0"/>
+          <w:sz w:val="21"/>
+          <w:szCs w:val="21"/>
+          <w14:ligatures w14:val="none"/>
+        </w:rPr>
+        <w:t>‘</w:t>
+      </w:r>
+      <w:r>
+        <w:rPr>
+          <w:rFonts w:ascii="Consolas" w:eastAsia="Times New Roman" w:hAnsi="Consolas" w:cs="Times New Roman"/>
+          <w:kern w:val="0"/>
+          <w:sz w:val="21"/>
+          <w:szCs w:val="21"/>
+          <w14:ligatures w14:val="none"/>
+        </w:rPr>
+        <w:t>c:/users/</w:t>
+      </w:r>
+      <w:r>
+        <w:rPr>
+          <w:rFonts w:ascii="Consolas" w:eastAsia="Times New Roman" w:hAnsi="Consolas" w:cs="Times New Roman"/>
+          <w:kern w:val="0"/>
+          <w:sz w:val="21"/>
+          <w:szCs w:val="21"/>
+          <w14:ligatures w14:val="none"/>
+        </w:rPr>
+        <w:t>software-Enginer</w:t>
+      </w:r>
+      <w:r>
+        <w:rPr>
+          <w:rFonts w:ascii="Consolas" w:eastAsia="Times New Roman" w:hAnsi="Consolas" w:cs="Times New Roman"/>
+          <w:kern w:val="0"/>
+          <w:sz w:val="21"/>
+          <w:szCs w:val="21"/>
+          <w14:ligatures w14:val="none"/>
+        </w:rPr>
+        <w:t>’ where cmd open default</w:t>
+      </w:r>
+      <w:r>
+        <w:rPr>
+          <w:rFonts w:ascii="Consolas" w:eastAsia="Times New Roman" w:hAnsi="Consolas" w:cs="Times New Roman"/>
+          <w:kern w:val="0"/>
+          <w:sz w:val="21"/>
+          <w:szCs w:val="21"/>
+          <w14:ligatures w14:val="none"/>
+        </w:rPr>
+        <w:t xml:space="preserve"> – allow SSH traffic from 0.0.0.0/0 </w:t>
+      </w:r>
+      <w:r>
+        <w:rPr>
+          <w:rFonts w:ascii="Consolas" w:eastAsia="Times New Roman" w:hAnsi="Consolas" w:cs="Times New Roman"/>
+          <w:kern w:val="0"/>
+          <w:sz w:val="21"/>
+          <w:szCs w:val="21"/>
+          <w14:ligatures w14:val="none"/>
+        </w:rPr>
+        <w:t xml:space="preserve"> //so we control server from our local pc. --- </w:t>
+      </w:r>
+      <w:r>
+        <w:rPr>
+          <w:rFonts w:ascii="Consolas" w:eastAsia="Times New Roman" w:hAnsi="Consolas" w:cs="Times New Roman"/>
+          <w:kern w:val="0"/>
+          <w:sz w:val="21"/>
+          <w:szCs w:val="21"/>
+          <w14:ligatures w14:val="none"/>
+        </w:rPr>
+        <w:t>launch</w:t>
+      </w:r>
+      <w:r>
+        <w:rPr>
+          <w:rFonts w:ascii="Consolas" w:eastAsia="Times New Roman" w:hAnsi="Consolas" w:cs="Times New Roman"/>
+          <w:kern w:val="0"/>
+          <w:sz w:val="21"/>
+          <w:szCs w:val="21"/>
+          <w14:ligatures w14:val="none"/>
+        </w:rPr>
+        <w:t xml:space="preserve"> Instance</w:t>
+      </w:r>
+      <w:r>
+        <w:rPr>
+          <w:rFonts w:ascii="Consolas" w:eastAsia="Times New Roman" w:hAnsi="Consolas" w:cs="Times New Roman"/>
+          <w:kern w:val="0"/>
+          <w:sz w:val="21"/>
+          <w:szCs w:val="21"/>
+          <w14:ligatures w14:val="none"/>
+        </w:rPr>
+        <w:t>.</w:t>
+      </w:r>
+      <w:r>
+        <w:rPr>
+          <w:rFonts w:ascii="Consolas" w:eastAsia="Times New Roman" w:hAnsi="Consolas" w:cs="Times New Roman"/>
+          <w:kern w:val="0"/>
+          <w:sz w:val="21"/>
+          <w:szCs w:val="21"/>
+          <w14:ligatures w14:val="none"/>
+        </w:rPr>
+        <w:br/>
+      </w:r>
+      <w:r>
+        <w:rPr>
+          <w:rFonts w:ascii="Consolas" w:eastAsia="Times New Roman" w:hAnsi="Consolas" w:cs="Times New Roman"/>
+          <w:kern w:val="0"/>
+          <w:sz w:val="21"/>
+          <w:szCs w:val="21"/>
+          <w14:ligatures w14:val="none"/>
+        </w:rPr>
+        <w:br/>
+      </w:r>
+      <w:r>
+        <w:rPr>
+          <w:rFonts w:ascii="Consolas" w:eastAsia="Times New Roman" w:hAnsi="Consolas" w:cs="Times New Roman"/>
+          <w:kern w:val="0"/>
+          <w:sz w:val="21"/>
+          <w:szCs w:val="21"/>
+          <w14:ligatures w14:val="none"/>
+        </w:rPr>
+        <w:t>2</w:t>
+      </w:r>
+      <w:r>
+        <w:rPr>
+          <w:rFonts w:ascii="Consolas" w:eastAsia="Times New Roman" w:hAnsi="Consolas" w:cs="Times New Roman"/>
+          <w:kern w:val="0"/>
+          <w:sz w:val="21"/>
+          <w:szCs w:val="21"/>
+          <w14:ligatures w14:val="none"/>
+        </w:rPr>
+        <w:t xml:space="preserve">&gt; </w:t>
+      </w:r>
+      <w:r>
+        <w:rPr>
+          <w:rFonts w:ascii="Consolas" w:eastAsia="Times New Roman" w:hAnsi="Consolas" w:cs="Times New Roman"/>
+          <w:kern w:val="0"/>
+          <w:sz w:val="21"/>
+          <w:szCs w:val="21"/>
+          <w14:ligatures w14:val="none"/>
+        </w:rPr>
+        <w:t xml:space="preserve">EC2 – </w:t>
+      </w:r>
+      <w:r>
+        <w:rPr>
+          <w:rFonts w:ascii="Consolas" w:eastAsia="Times New Roman" w:hAnsi="Consolas" w:cs="Times New Roman"/>
+          <w:kern w:val="0"/>
+          <w:sz w:val="21"/>
+          <w:szCs w:val="21"/>
+          <w14:ligatures w14:val="none"/>
+        </w:rPr>
+        <w:t xml:space="preserve">elastic Ips </w:t>
+      </w:r>
+      <w:r>
+        <w:rPr>
+          <w:rFonts w:ascii="Consolas" w:eastAsia="Times New Roman" w:hAnsi="Consolas" w:cs="Times New Roman"/>
+          <w:kern w:val="0"/>
+          <w:sz w:val="21"/>
+          <w:szCs w:val="21"/>
+          <w14:ligatures w14:val="none"/>
+        </w:rPr>
+        <w:t xml:space="preserve">– </w:t>
+      </w:r>
+      <w:r>
+        <w:rPr>
+          <w:rFonts w:ascii="Consolas" w:eastAsia="Times New Roman" w:hAnsi="Consolas" w:cs="Times New Roman"/>
+          <w:b/>
+          <w:bCs/>
+          <w:kern w:val="0"/>
+          <w:sz w:val="21"/>
+          <w:szCs w:val="21"/>
+          <w14:ligatures w14:val="none"/>
+        </w:rPr>
+        <w:t>allocate elastic</w:t>
+      </w:r>
+      <w:r>
+        <w:rPr>
+          <w:rFonts w:ascii="Consolas" w:eastAsia="Times New Roman" w:hAnsi="Consolas" w:cs="Times New Roman"/>
+          <w:b/>
+          <w:bCs/>
+          <w:kern w:val="0"/>
+          <w:sz w:val="21"/>
+          <w:szCs w:val="21"/>
+          <w14:ligatures w14:val="none"/>
+        </w:rPr>
+        <w:t>(fixed)</w:t>
+      </w:r>
+      <w:r>
+        <w:rPr>
+          <w:rFonts w:ascii="Consolas" w:eastAsia="Times New Roman" w:hAnsi="Consolas" w:cs="Times New Roman"/>
+          <w:b/>
+          <w:bCs/>
+          <w:kern w:val="0"/>
+          <w:sz w:val="21"/>
+          <w:szCs w:val="21"/>
+          <w14:ligatures w14:val="none"/>
+        </w:rPr>
+        <w:t xml:space="preserve"> ip</w:t>
+      </w:r>
+      <w:r>
+        <w:rPr>
+          <w:rFonts w:ascii="Consolas" w:eastAsia="Times New Roman" w:hAnsi="Consolas" w:cs="Times New Roman"/>
+          <w:kern w:val="0"/>
+          <w:sz w:val="21"/>
+          <w:szCs w:val="21"/>
+          <w14:ligatures w14:val="none"/>
+        </w:rPr>
+        <w:t>.</w:t>
       </w:r>
       <w:r>
         <w:rPr>
@@ -32213,6 +32850,47 @@
           <w14:ligatures w14:val="none"/>
         </w:rPr>
         <w:br/>
+      </w:r>
+      <w:r>
+        <w:rPr>
+          <w:rFonts w:ascii="Consolas" w:eastAsia="Times New Roman" w:hAnsi="Consolas" w:cs="Times New Roman"/>
+          <w:kern w:val="0"/>
+          <w:sz w:val="21"/>
+          <w:szCs w:val="21"/>
+          <w14:ligatures w14:val="none"/>
+        </w:rPr>
+        <w:t>3</w:t>
+      </w:r>
+      <w:r>
+        <w:rPr>
+          <w:rFonts w:ascii="Consolas" w:eastAsia="Times New Roman" w:hAnsi="Consolas" w:cs="Times New Roman"/>
+          <w:kern w:val="0"/>
+          <w:sz w:val="21"/>
+          <w:szCs w:val="21"/>
+          <w14:ligatures w14:val="none"/>
+        </w:rPr>
+        <w:t xml:space="preserve">&gt; </w:t>
+      </w:r>
+      <w:r>
+        <w:rPr>
+          <w:rFonts w:ascii="Consolas" w:eastAsia="Times New Roman" w:hAnsi="Consolas" w:cs="Times New Roman"/>
+          <w:b/>
+          <w:bCs/>
+          <w:kern w:val="0"/>
+          <w:sz w:val="21"/>
+          <w:szCs w:val="21"/>
+          <w14:ligatures w14:val="none"/>
+        </w:rPr>
+        <w:t xml:space="preserve">Connect server to local terminal: </w:t>
+      </w:r>
+      <w:r>
+        <w:rPr>
+          <w:rFonts w:ascii="Consolas" w:eastAsia="Times New Roman" w:hAnsi="Consolas" w:cs="Times New Roman"/>
+          <w:kern w:val="0"/>
+          <w:sz w:val="21"/>
+          <w:szCs w:val="21"/>
+          <w14:ligatures w14:val="none"/>
+        </w:rPr>
         <w:t>EC2 – instances</w:t>
       </w:r>
       <w:r>
@@ -32243,7 +32921,190 @@
           <w:szCs w:val="21"/>
           <w14:ligatures w14:val="none"/>
         </w:rPr>
-        <w:t xml:space="preserve"> – copy example ssh cmd.</w:t>
+        <w:t xml:space="preserve"> – copy example ssh cmd</w:t>
+      </w:r>
+      <w:r>
+        <w:rPr>
+          <w:rFonts w:ascii="Consolas" w:eastAsia="Times New Roman" w:hAnsi="Consolas" w:cs="Times New Roman"/>
+          <w:kern w:val="0"/>
+          <w:sz w:val="21"/>
+          <w:szCs w:val="21"/>
+          <w14:ligatures w14:val="none"/>
+        </w:rPr>
+        <w:t xml:space="preserve"> at bottom of the page</w:t>
+      </w:r>
+      <w:r>
+        <w:rPr>
+          <w:rFonts w:ascii="Consolas" w:eastAsia="Times New Roman" w:hAnsi="Consolas" w:cs="Times New Roman"/>
+          <w:kern w:val="0"/>
+          <w:sz w:val="21"/>
+          <w:szCs w:val="21"/>
+          <w14:ligatures w14:val="none"/>
+        </w:rPr>
+        <w:t>.</w:t>
+      </w:r>
+    </w:p>
+    <w:p>
+      <w:pPr>
+        <w:pStyle w:val="ListParagraph"/>
+        <w:spacing w:after="0" w:line="285" w:lineRule="atLeast"/>
+        <w:rPr>
+          <w:rFonts w:ascii="Consolas" w:eastAsia="Times New Roman" w:hAnsi="Consolas" w:cs="Times New Roman"/>
+          <w:kern w:val="0"/>
+          <w:sz w:val="21"/>
+          <w:szCs w:val="21"/>
+          <w14:ligatures w14:val="none"/>
+        </w:rPr>
+      </w:pPr>
+      <w:r>
+        <w:rPr>
+          <w:rFonts w:ascii="Consolas" w:eastAsia="Times New Roman" w:hAnsi="Consolas" w:cs="Times New Roman"/>
+          <w:kern w:val="0"/>
+          <w:sz w:val="21"/>
+          <w:szCs w:val="21"/>
+          <w14:ligatures w14:val="none"/>
+        </w:rPr>
+        <w:t xml:space="preserve">In </w:t>
+      </w:r>
+      <w:r>
+        <w:rPr>
+          <w:rFonts w:ascii="Consolas" w:eastAsia="Times New Roman" w:hAnsi="Consolas" w:cs="Times New Roman"/>
+          <w:kern w:val="0"/>
+          <w:sz w:val="21"/>
+          <w:szCs w:val="21"/>
+          <w14:ligatures w14:val="none"/>
+        </w:rPr>
+        <w:t xml:space="preserve">local </w:t>
+      </w:r>
+      <w:r>
+        <w:rPr>
+          <w:rFonts w:ascii="Consolas" w:eastAsia="Times New Roman" w:hAnsi="Consolas" w:cs="Times New Roman"/>
+          <w:kern w:val="0"/>
+          <w:sz w:val="21"/>
+          <w:szCs w:val="21"/>
+          <w14:ligatures w14:val="none"/>
+        </w:rPr>
+        <w:t>PC</w:t>
+      </w:r>
+      <w:r>
+        <w:rPr>
+          <w:rFonts w:ascii="Consolas" w:eastAsia="Times New Roman" w:hAnsi="Consolas" w:cs="Times New Roman"/>
+          <w:kern w:val="0"/>
+          <w:sz w:val="21"/>
+          <w:szCs w:val="21"/>
+          <w14:ligatures w14:val="none"/>
+        </w:rPr>
+        <w:t xml:space="preserve"> – open cmd</w:t>
+      </w:r>
+      <w:r>
+        <w:rPr>
+          <w:rFonts w:ascii="Consolas" w:eastAsia="Times New Roman" w:hAnsi="Consolas" w:cs="Times New Roman"/>
+          <w:kern w:val="0"/>
+          <w:sz w:val="21"/>
+          <w:szCs w:val="21"/>
+          <w14:ligatures w14:val="none"/>
+        </w:rPr>
+        <w:t>(where key-file stored i.e in our case c:/users/pc</w:t>
+      </w:r>
+      <w:r>
+        <w:rPr>
+          <w:rFonts w:ascii="Consolas" w:eastAsia="Times New Roman" w:hAnsi="Consolas" w:cs="Times New Roman"/>
+          <w:kern w:val="0"/>
+          <w:sz w:val="21"/>
+          <w:szCs w:val="21"/>
+          <w14:ligatures w14:val="none"/>
+        </w:rPr>
+        <w:t xml:space="preserve"> by just search </w:t>
+      </w:r>
+      <w:r>
+        <w:rPr>
+          <w:rFonts w:ascii="Consolas" w:eastAsia="Times New Roman" w:hAnsi="Consolas" w:cs="Times New Roman"/>
+          <w:kern w:val="0"/>
+          <w:sz w:val="21"/>
+          <w:szCs w:val="21"/>
+          <w14:ligatures w14:val="none"/>
+        </w:rPr>
+        <w:t>)</w:t>
+      </w:r>
+      <w:r>
+        <w:rPr>
+          <w:rFonts w:ascii="Consolas" w:eastAsia="Times New Roman" w:hAnsi="Consolas" w:cs="Times New Roman"/>
+          <w:kern w:val="0"/>
+          <w:sz w:val="21"/>
+          <w:szCs w:val="21"/>
+          <w14:ligatures w14:val="none"/>
+        </w:rPr>
+        <w:t xml:space="preserve"> – run SSH cmd</w:t>
+      </w:r>
+      <w:r>
+        <w:rPr>
+          <w:rFonts w:ascii="Consolas" w:eastAsia="Times New Roman" w:hAnsi="Consolas" w:cs="Times New Roman"/>
+          <w:kern w:val="0"/>
+          <w:sz w:val="21"/>
+          <w:szCs w:val="21"/>
+          <w14:ligatures w14:val="none"/>
+        </w:rPr>
+        <w:t xml:space="preserve"> that mentioned on SSH client page</w:t>
+      </w:r>
+      <w:r>
+        <w:rPr>
+          <w:rFonts w:ascii="Consolas" w:eastAsia="Times New Roman" w:hAnsi="Consolas" w:cs="Times New Roman"/>
+          <w:kern w:val="0"/>
+          <w:sz w:val="21"/>
+          <w:szCs w:val="21"/>
+          <w14:ligatures w14:val="none"/>
+        </w:rPr>
+        <w:t xml:space="preserve"> – yes –</w:t>
+      </w:r>
+      <w:r>
+        <w:rPr>
+          <w:rFonts w:ascii="Consolas" w:eastAsia="Times New Roman" w:hAnsi="Consolas" w:cs="Times New Roman"/>
+          <w:kern w:val="0"/>
+          <w:sz w:val="21"/>
+          <w:szCs w:val="21"/>
+          <w14:ligatures w14:val="none"/>
+        </w:rPr>
+        <w:t xml:space="preserve"> Aft</w:t>
+      </w:r>
+      <w:r>
+        <w:rPr>
+          <w:rFonts w:ascii="Consolas" w:eastAsia="Times New Roman" w:hAnsi="Consolas" w:cs="Times New Roman"/>
+          <w:kern w:val="0"/>
+          <w:sz w:val="21"/>
+          <w:szCs w:val="21"/>
+          <w14:ligatures w14:val="none"/>
+        </w:rPr>
+        <w:t>er that</w:t>
+      </w:r>
+      <w:r>
+        <w:rPr>
+          <w:rFonts w:ascii="Consolas" w:eastAsia="Times New Roman" w:hAnsi="Consolas" w:cs="Times New Roman"/>
+          <w:kern w:val="0"/>
+          <w:sz w:val="21"/>
+          <w:szCs w:val="21"/>
+          <w14:ligatures w14:val="none"/>
+        </w:rPr>
+        <w:t xml:space="preserve"> you</w:t>
+      </w:r>
+      <w:r>
+        <w:rPr>
+          <w:rFonts w:ascii="Consolas" w:eastAsia="Times New Roman" w:hAnsi="Consolas" w:cs="Times New Roman"/>
+          <w:kern w:val="0"/>
+          <w:sz w:val="21"/>
+          <w:szCs w:val="21"/>
+          <w14:ligatures w14:val="none"/>
+        </w:rPr>
+        <w:t>r cmd-terminal</w:t>
+      </w:r>
+      <w:r>
+        <w:rPr>
+          <w:rFonts w:ascii="Consolas" w:eastAsia="Times New Roman" w:hAnsi="Consolas" w:cs="Times New Roman"/>
+          <w:kern w:val="0"/>
+          <w:sz w:val="21"/>
+          <w:szCs w:val="21"/>
+          <w14:ligatures w14:val="none"/>
+        </w:rPr>
+        <w:t xml:space="preserve"> connected with virtual server.</w:t>
       </w:r>
       <w:r>
         <w:rPr>
@@ -32254,47 +33115,6 @@
           <w14:ligatures w14:val="none"/>
         </w:rPr>
         <w:br/>
-        <w:t>local system – open cmd</w:t>
-      </w:r>
-      <w:r>
-        <w:rPr>
-          <w:rFonts w:ascii="Consolas" w:eastAsia="Times New Roman" w:hAnsi="Consolas" w:cs="Times New Roman"/>
-          <w:kern w:val="0"/>
-          <w:sz w:val="21"/>
-          <w:szCs w:val="21"/>
-          <w14:ligatures w14:val="none"/>
-        </w:rPr>
-        <w:t>(where key-file stored i.e in our case c:/users/pc)</w:t>
-      </w:r>
-      <w:r>
-        <w:rPr>
-          <w:rFonts w:ascii="Consolas" w:eastAsia="Times New Roman" w:hAnsi="Consolas" w:cs="Times New Roman"/>
-          <w:kern w:val="0"/>
-          <w:sz w:val="21"/>
-          <w:szCs w:val="21"/>
-          <w14:ligatures w14:val="none"/>
-        </w:rPr>
-        <w:t xml:space="preserve"> – run SSH cmd</w:t>
-      </w:r>
-      <w:r>
-        <w:rPr>
-          <w:rFonts w:ascii="Consolas" w:eastAsia="Times New Roman" w:hAnsi="Consolas" w:cs="Times New Roman"/>
-          <w:kern w:val="0"/>
-          <w:sz w:val="21"/>
-          <w:szCs w:val="21"/>
-          <w14:ligatures w14:val="none"/>
-        </w:rPr>
-        <w:t xml:space="preserve"> that mentioned on SSH client page.</w:t>
-      </w:r>
-      <w:r>
-        <w:rPr>
-          <w:rFonts w:ascii="Consolas" w:eastAsia="Times New Roman" w:hAnsi="Consolas" w:cs="Times New Roman"/>
-          <w:kern w:val="0"/>
-          <w:sz w:val="21"/>
-          <w:szCs w:val="21"/>
-          <w14:ligatures w14:val="none"/>
-        </w:rPr>
-        <w:t xml:space="preserve"> After you connected with virtual server.</w:t>
       </w:r>
       <w:r>
         <w:rPr>
@@ -32314,17 +33134,27 @@
           <w:szCs w:val="21"/>
           <w14:ligatures w14:val="none"/>
         </w:rPr>
-        <w:br/>
-      </w:r>
-      <w:r>
-        <w:rPr>
-          <w:rFonts w:ascii="Consolas" w:eastAsia="Times New Roman" w:hAnsi="Consolas" w:cs="Times New Roman"/>
-          <w:kern w:val="0"/>
-          <w:sz w:val="21"/>
-          <w:szCs w:val="21"/>
-          <w14:ligatures w14:val="none"/>
-        </w:rPr>
-        <w:t xml:space="preserve">&gt; </w:t>
+        <w:t>3.1</w:t>
+      </w:r>
+      <w:r>
+        <w:rPr>
+          <w:rFonts w:ascii="Consolas" w:eastAsia="Times New Roman" w:hAnsi="Consolas" w:cs="Times New Roman"/>
+          <w:kern w:val="0"/>
+          <w:sz w:val="21"/>
+          <w:szCs w:val="21"/>
+          <w14:ligatures w14:val="none"/>
+        </w:rPr>
+        <w:t>&gt;</w:t>
+      </w:r>
+      <w:r>
+        <w:rPr>
+          <w:rFonts w:ascii="Consolas" w:eastAsia="Times New Roman" w:hAnsi="Consolas" w:cs="Times New Roman"/>
+          <w:kern w:val="0"/>
+          <w:sz w:val="21"/>
+          <w:szCs w:val="21"/>
+          <w14:ligatures w14:val="none"/>
+        </w:rPr>
+        <w:t xml:space="preserve"> </w:t>
       </w:r>
       <w:r>
         <w:rPr>
@@ -32385,6 +33215,16 @@
           <w:szCs w:val="21"/>
           <w14:ligatures w14:val="none"/>
         </w:rPr>
+        <w:t xml:space="preserve">   cat index.js   cd ..</w:t>
+      </w:r>
+      <w:r>
+        <w:rPr>
+          <w:rFonts w:ascii="Consolas" w:eastAsia="Times New Roman" w:hAnsi="Consolas" w:cs="Times New Roman"/>
+          <w:kern w:val="0"/>
+          <w:sz w:val="21"/>
+          <w:szCs w:val="21"/>
+          <w14:ligatures w14:val="none"/>
+        </w:rPr>
         <w:br/>
       </w:r>
       <w:r>
@@ -32405,18 +33245,188 @@
           <w:szCs w:val="21"/>
           <w14:ligatures w14:val="none"/>
         </w:rPr>
-        <w:t xml:space="preserve">&gt; </w:t>
-      </w:r>
-      <w:r>
-        <w:rPr>
-          <w:rFonts w:ascii="Consolas" w:eastAsia="Times New Roman" w:hAnsi="Consolas" w:cs="Times New Roman"/>
-          <w:kern w:val="0"/>
-          <w:sz w:val="21"/>
-          <w:szCs w:val="21"/>
-          <w14:ligatures w14:val="none"/>
-        </w:rPr>
-        <w:t>now run project in virtual server using same cmds as we run dockerfile project on our local system.</w:t>
-      </w:r>
+        <w:t>3.2</w:t>
+      </w:r>
+      <w:r>
+        <w:rPr>
+          <w:rFonts w:ascii="Consolas" w:eastAsia="Times New Roman" w:hAnsi="Consolas" w:cs="Times New Roman"/>
+          <w:kern w:val="0"/>
+          <w:sz w:val="21"/>
+          <w:szCs w:val="21"/>
+          <w14:ligatures w14:val="none"/>
+        </w:rPr>
+        <w:t>&gt;</w:t>
+      </w:r>
+      <w:r>
+        <w:rPr>
+          <w:rFonts w:ascii="Consolas" w:eastAsia="Times New Roman" w:hAnsi="Consolas" w:cs="Times New Roman"/>
+          <w:kern w:val="0"/>
+          <w:sz w:val="21"/>
+          <w:szCs w:val="21"/>
+          <w14:ligatures w14:val="none"/>
+        </w:rPr>
+        <w:t xml:space="preserve"> </w:t>
+      </w:r>
+      <w:r>
+        <w:rPr>
+          <w:rFonts w:ascii="Consolas" w:eastAsia="Times New Roman" w:hAnsi="Consolas" w:cs="Times New Roman"/>
+          <w:color w:val="EE0000"/>
+          <w:kern w:val="0"/>
+          <w:sz w:val="21"/>
+          <w:szCs w:val="21"/>
+          <w14:ligatures w14:val="none"/>
+        </w:rPr>
+        <w:t>so 1</w:t>
+      </w:r>
+      <w:r>
+        <w:rPr>
+          <w:rFonts w:ascii="Consolas" w:eastAsia="Times New Roman" w:hAnsi="Consolas" w:cs="Times New Roman"/>
+          <w:color w:val="EE0000"/>
+          <w:kern w:val="0"/>
+          <w:sz w:val="21"/>
+          <w:szCs w:val="21"/>
+          <w:vertAlign w:val="superscript"/>
+          <w14:ligatures w14:val="none"/>
+        </w:rPr>
+        <w:t>st</w:t>
+      </w:r>
+      <w:r>
+        <w:rPr>
+          <w:rFonts w:ascii="Consolas" w:eastAsia="Times New Roman" w:hAnsi="Consolas" w:cs="Times New Roman"/>
+          <w:color w:val="EE0000"/>
+          <w:kern w:val="0"/>
+          <w:sz w:val="21"/>
+          <w:szCs w:val="21"/>
+          <w14:ligatures w14:val="none"/>
+        </w:rPr>
+        <w:t xml:space="preserve"> </w:t>
+      </w:r>
+      <w:r>
+        <w:rPr>
+          <w:rFonts w:ascii="Consolas" w:eastAsia="Times New Roman" w:hAnsi="Consolas" w:cs="Times New Roman"/>
+          <w:color w:val="EE0000"/>
+          <w:kern w:val="0"/>
+          <w:sz w:val="21"/>
+          <w:szCs w:val="21"/>
+          <w14:ligatures w14:val="none"/>
+        </w:rPr>
+        <w:t>install docker in ubuntu</w:t>
+      </w:r>
+      <w:r>
+        <w:rPr>
+          <w:rFonts w:ascii="Consolas" w:eastAsia="Times New Roman" w:hAnsi="Consolas" w:cs="Times New Roman"/>
+          <w:color w:val="EE0000"/>
+          <w:kern w:val="0"/>
+          <w:sz w:val="21"/>
+          <w:szCs w:val="21"/>
+          <w14:ligatures w14:val="none"/>
+        </w:rPr>
+        <w:t xml:space="preserve"> on root path</w:t>
+      </w:r>
+      <w:r>
+        <w:rPr>
+          <w:rFonts w:ascii="Consolas" w:eastAsia="Times New Roman" w:hAnsi="Consolas" w:cs="Times New Roman"/>
+          <w:color w:val="EE0000"/>
+          <w:kern w:val="0"/>
+          <w:sz w:val="21"/>
+          <w:szCs w:val="21"/>
+          <w14:ligatures w14:val="none"/>
+        </w:rPr>
+        <w:t xml:space="preserve"> ~$</w:t>
+      </w:r>
+      <w:r>
+        <w:rPr>
+          <w:rFonts w:ascii="Consolas" w:eastAsia="Times New Roman" w:hAnsi="Consolas" w:cs="Times New Roman"/>
+          <w:color w:val="EE0000"/>
+          <w:kern w:val="0"/>
+          <w:sz w:val="21"/>
+          <w:szCs w:val="21"/>
+          <w14:ligatures w14:val="none"/>
+        </w:rPr>
+        <w:t xml:space="preserve"> //see doc &amp; install docker on </w:t>
+      </w:r>
+      <w:r>
+        <w:rPr>
+          <w:rFonts w:ascii="Consolas" w:eastAsia="Times New Roman" w:hAnsi="Consolas" w:cs="Times New Roman"/>
+          <w:color w:val="EE0000"/>
+          <w:kern w:val="0"/>
+          <w:sz w:val="21"/>
+          <w:szCs w:val="21"/>
+          <w14:ligatures w14:val="none"/>
+        </w:rPr>
+        <w:t xml:space="preserve">ubuntu </w:t>
+      </w:r>
+      <w:r>
+        <w:rPr>
+          <w:rFonts w:ascii="Consolas" w:eastAsia="Times New Roman" w:hAnsi="Consolas" w:cs="Times New Roman"/>
+          <w:color w:val="EE0000"/>
+          <w:kern w:val="0"/>
+          <w:sz w:val="21"/>
+          <w:szCs w:val="21"/>
+          <w14:ligatures w14:val="none"/>
+        </w:rPr>
+        <w:t>server</w:t>
+      </w:r>
+      <w:r>
+        <w:rPr>
+          <w:rFonts w:ascii="Consolas" w:eastAsia="Times New Roman" w:hAnsi="Consolas" w:cs="Times New Roman"/>
+          <w:color w:val="EE0000"/>
+          <w:kern w:val="0"/>
+          <w:sz w:val="21"/>
+          <w:szCs w:val="21"/>
+          <w14:ligatures w14:val="none"/>
+        </w:rPr>
+        <w:t>.</w:t>
+      </w:r>
+      <w:r>
+        <w:rPr>
+          <w:rFonts w:ascii="Consolas" w:eastAsia="Times New Roman" w:hAnsi="Consolas" w:cs="Times New Roman"/>
+          <w:color w:val="EE0000"/>
+          <w:kern w:val="0"/>
+          <w:sz w:val="21"/>
+          <w:szCs w:val="21"/>
+          <w14:ligatures w14:val="none"/>
+        </w:rPr>
+        <w:t xml:space="preserve"> </w:t>
+      </w:r>
+      <w:hyperlink r:id="rId33" w:history="1">
+        <w:r>
+          <w:rPr>
+            <w:rStyle w:val="Hyperlink"/>
+            <w:rFonts w:ascii="Consolas" w:eastAsia="Times New Roman" w:hAnsi="Consolas" w:cs="Times New Roman"/>
+            <w:color w:val="EE0000"/>
+            <w:kern w:val="0"/>
+            <w:sz w:val="21"/>
+            <w:szCs w:val="21"/>
+            <w14:ligatures w14:val="none"/>
+          </w:rPr>
+          <w:t>https://docs.docker.com/engine/install/ubuntu/</w:t>
+        </w:r>
+      </w:hyperlink>
+      <w:r>
+        <w:rPr>
+          <w:rFonts w:ascii="Consolas" w:eastAsia="Times New Roman" w:hAnsi="Consolas" w:cs="Times New Roman"/>
+          <w:color w:val="EE0000"/>
+          <w:kern w:val="0"/>
+          <w:sz w:val="21"/>
+          <w:szCs w:val="21"/>
+          <w14:ligatures w14:val="none"/>
+        </w:rPr>
+        <w:t xml:space="preserve"> </w:t>
+      </w:r>
+    </w:p>
+    <w:p>
+      <w:pPr>
+        <w:pStyle w:val="ListParagraph"/>
+        <w:spacing w:after="0" w:line="285" w:lineRule="atLeast"/>
+        <w:rPr>
+          <w:rFonts w:ascii="Consolas" w:eastAsia="Times New Roman" w:hAnsi="Consolas" w:cs="Times New Roman"/>
+          <w:kern w:val="0"/>
+          <w:sz w:val="21"/>
+          <w:szCs w:val="21"/>
+          <w14:ligatures w14:val="none"/>
+        </w:rPr>
+      </w:pPr>
       <w:r>
         <w:rPr>
           <w:rFonts w:ascii="Consolas" w:eastAsia="Times New Roman" w:hAnsi="Consolas" w:cs="Times New Roman"/>
@@ -32426,18 +33436,72 @@
           <w14:ligatures w14:val="none"/>
         </w:rPr>
         <w:br/>
-        <w:t>install docker in ubuntu //see doc &amp; install docker on server root then.</w:t>
-      </w:r>
-      <w:r>
-        <w:rPr>
-          <w:rFonts w:ascii="Consolas" w:eastAsia="Times New Roman" w:hAnsi="Consolas" w:cs="Times New Roman"/>
-          <w:kern w:val="0"/>
-          <w:sz w:val="21"/>
-          <w:szCs w:val="21"/>
-          <w14:ligatures w14:val="none"/>
-        </w:rPr>
-        <w:br/>
+      </w:r>
+      <w:r>
+        <w:rPr>
+          <w:rFonts w:ascii="Consolas" w:eastAsia="Times New Roman" w:hAnsi="Consolas" w:cs="Times New Roman"/>
+          <w:kern w:val="0"/>
+          <w:sz w:val="21"/>
+          <w:szCs w:val="21"/>
+          <w14:ligatures w14:val="none"/>
+        </w:rPr>
+        <w:t xml:space="preserve">3.3&gt; </w:t>
+      </w:r>
+      <w:r>
+        <w:rPr>
+          <w:rFonts w:ascii="Consolas" w:eastAsia="Times New Roman" w:hAnsi="Consolas" w:cs="Times New Roman"/>
+          <w:kern w:val="0"/>
+          <w:sz w:val="21"/>
+          <w:szCs w:val="21"/>
+          <w14:ligatures w14:val="none"/>
+        </w:rPr>
+        <w:t>now create docker image from dockerfile &amp; run container(code) in virtual server using same cmds as we run dockerfile project on our local system.</w:t>
+      </w:r>
+    </w:p>
+    <w:p>
+      <w:pPr>
+        <w:pStyle w:val="ListParagraph"/>
+        <w:spacing w:after="0" w:line="285" w:lineRule="atLeast"/>
+        <w:rPr>
+          <w:rFonts w:ascii="Consolas" w:eastAsia="Times New Roman" w:hAnsi="Consolas" w:cs="Times New Roman"/>
+          <w:kern w:val="0"/>
+          <w:sz w:val="21"/>
+          <w:szCs w:val="21"/>
+          <w14:ligatures w14:val="none"/>
+        </w:rPr>
+      </w:pPr>
+    </w:p>
+    <w:p>
+      <w:pPr>
+        <w:pStyle w:val="ListParagraph"/>
+        <w:spacing w:after="0" w:line="285" w:lineRule="atLeast"/>
+        <w:rPr>
+          <w:rFonts w:ascii="Consolas" w:eastAsia="Times New Roman" w:hAnsi="Consolas" w:cs="Times New Roman"/>
+          <w:kern w:val="0"/>
+          <w:sz w:val="21"/>
+          <w:szCs w:val="21"/>
+          <w14:ligatures w14:val="none"/>
+        </w:rPr>
+      </w:pPr>
+      <w:r>
+        <w:rPr>
+          <w:rFonts w:ascii="Consolas" w:eastAsia="Times New Roman" w:hAnsi="Consolas" w:cs="Times New Roman"/>
+          <w:kern w:val="0"/>
+          <w:sz w:val="21"/>
+          <w:szCs w:val="21"/>
+          <w14:ligatures w14:val="none"/>
+        </w:rPr>
         <w:t>cd level5</w:t>
+      </w:r>
+      <w:r>
+        <w:rPr>
+          <w:rFonts w:ascii="Consolas" w:eastAsia="Times New Roman" w:hAnsi="Consolas" w:cs="Times New Roman"/>
+          <w:kern w:val="0"/>
+          <w:sz w:val="21"/>
+          <w:szCs w:val="21"/>
+          <w14:ligatures w14:val="none"/>
+        </w:rPr>
+        <w:t xml:space="preserve">  //level5 is repo name, use your repo name here</w:t>
       </w:r>
       <w:r>
         <w:rPr>
@@ -32482,7 +33546,17 @@
           <w:szCs w:val="21"/>
           <w14:ligatures w14:val="none"/>
         </w:rPr>
-        <w:t xml:space="preserve">Sudo docker run </w:t>
+        <w:t>s</w:t>
+      </w:r>
+      <w:r>
+        <w:rPr>
+          <w:rFonts w:ascii="Consolas" w:eastAsia="Times New Roman" w:hAnsi="Consolas" w:cs="Times New Roman"/>
+          <w:kern w:val="0"/>
+          <w:sz w:val="21"/>
+          <w:szCs w:val="21"/>
+          <w14:ligatures w14:val="none"/>
+        </w:rPr>
+        <w:t xml:space="preserve">udo docker run </w:t>
       </w:r>
       <w:r>
         <w:rPr>
@@ -32513,6 +33587,59 @@
           <w14:ligatures w14:val="none"/>
         </w:rPr>
         <w:t xml:space="preserve"> // run container in background.</w:t>
+      </w:r>
+    </w:p>
+    <w:p>
+      <w:pPr>
+        <w:pStyle w:val="ListParagraph"/>
+        <w:spacing w:line="285" w:lineRule="atLeast"/>
+        <w:rPr>
+          <w:rFonts w:ascii="Consolas" w:eastAsia="Times New Roman" w:hAnsi="Consolas" w:cs="Times New Roman"/>
+          <w:kern w:val="0"/>
+          <w:sz w:val="21"/>
+          <w:szCs w:val="21"/>
+          <w14:ligatures w14:val="none"/>
+        </w:rPr>
+      </w:pPr>
+      <w:r>
+        <w:rPr>
+          <w:rFonts w:ascii="Consolas" w:eastAsia="Times New Roman" w:hAnsi="Consolas" w:cs="Times New Roman"/>
+          <w:kern w:val="0"/>
+          <w:sz w:val="21"/>
+          <w:szCs w:val="21"/>
+          <w14:ligatures w14:val="none"/>
+        </w:rPr>
+        <w:t>sudo docker ps</w:t>
+      </w:r>
+      <w:r>
+        <w:rPr>
+          <w:rFonts w:ascii="Consolas" w:eastAsia="Times New Roman" w:hAnsi="Consolas" w:cs="Times New Roman"/>
+          <w:kern w:val="0"/>
+          <w:sz w:val="21"/>
+          <w:szCs w:val="21"/>
+          <w14:ligatures w14:val="none"/>
+        </w:rPr>
+        <w:t xml:space="preserve">   // </w:t>
+      </w:r>
+      <w:r>
+        <w:rPr>
+          <w:rFonts w:ascii="Consolas" w:eastAsia="Times New Roman" w:hAnsi="Consolas" w:cs="Times New Roman"/>
+          <w:kern w:val="0"/>
+          <w:sz w:val="21"/>
+          <w:szCs w:val="21"/>
+          <w14:ligatures w14:val="none"/>
+        </w:rPr>
+        <w:t xml:space="preserve">Check </w:t>
+      </w:r>
+      <w:r>
+        <w:rPr>
+          <w:rFonts w:ascii="Consolas" w:eastAsia="Times New Roman" w:hAnsi="Consolas" w:cs="Times New Roman"/>
+          <w:kern w:val="0"/>
+          <w:sz w:val="21"/>
+          <w:szCs w:val="21"/>
+          <w14:ligatures w14:val="none"/>
+        </w:rPr>
+        <w:t>running docker containers</w:t>
       </w:r>
     </w:p>
     <w:p>
@@ -32595,9 +33722,10 @@
           <w:szCs w:val="21"/>
           <w14:ligatures w14:val="none"/>
         </w:rPr>
+        <w:lastRenderedPageBreak/>
         <w:t xml:space="preserve">In local brower: </w:t>
       </w:r>
-      <w:hyperlink r:id="rId32" w:history="1">
+      <w:hyperlink r:id="rId34" w:history="1">
         <w:r>
           <w:rPr>
             <w:rStyle w:val="Hyperlink"/>
@@ -32640,28 +33768,77 @@
           <w14:ligatures w14:val="none"/>
         </w:rPr>
         <w:br/>
-        <w:t>EC2 – network &amp; security – security group – open 1</w:t>
-      </w:r>
-      <w:r>
-        <w:rPr>
-          <w:rFonts w:ascii="Consolas" w:eastAsia="Times New Roman" w:hAnsi="Consolas" w:cs="Times New Roman"/>
-          <w:kern w:val="0"/>
-          <w:sz w:val="21"/>
-          <w:szCs w:val="21"/>
-          <w:vertAlign w:val="superscript"/>
-          <w14:ligatures w14:val="none"/>
-        </w:rPr>
-        <w:t>st</w:t>
-      </w:r>
-      <w:r>
-        <w:rPr>
-          <w:rFonts w:ascii="Consolas" w:eastAsia="Times New Roman" w:hAnsi="Consolas" w:cs="Times New Roman"/>
-          <w:kern w:val="0"/>
-          <w:sz w:val="21"/>
-          <w:szCs w:val="21"/>
-          <w14:ligatures w14:val="none"/>
-        </w:rPr>
-        <w:t xml:space="preserve"> group – edit inbound rules – add rule : custom TCP TCP 5000 0.0.0.0/0</w:t>
+        <w:t>EC2 – network &amp; security – security group</w:t>
+      </w:r>
+      <w:r>
+        <w:rPr>
+          <w:rFonts w:ascii="Consolas" w:eastAsia="Times New Roman" w:hAnsi="Consolas" w:cs="Times New Roman"/>
+          <w:kern w:val="0"/>
+          <w:sz w:val="21"/>
+          <w:szCs w:val="21"/>
+          <w14:ligatures w14:val="none"/>
+        </w:rPr>
+        <w:t xml:space="preserve"> –</w:t>
+      </w:r>
+      <w:r>
+        <w:rPr>
+          <w:rFonts w:ascii="Consolas" w:eastAsia="Times New Roman" w:hAnsi="Consolas" w:cs="Times New Roman"/>
+          <w:kern w:val="0"/>
+          <w:sz w:val="21"/>
+          <w:szCs w:val="21"/>
+          <w14:ligatures w14:val="none"/>
+        </w:rPr>
+        <w:t xml:space="preserve"> </w:t>
+      </w:r>
+      <w:r>
+        <w:rPr>
+          <w:rFonts w:ascii="Consolas" w:eastAsia="Times New Roman" w:hAnsi="Consolas" w:cs="Times New Roman"/>
+          <w:kern w:val="0"/>
+          <w:sz w:val="21"/>
+          <w:szCs w:val="21"/>
+          <w14:ligatures w14:val="none"/>
+        </w:rPr>
+        <w:t>open ‘</w:t>
+      </w:r>
+      <w:r>
+        <w:rPr>
+          <w:rFonts w:ascii="Consolas" w:eastAsia="Times New Roman" w:hAnsi="Consolas" w:cs="Times New Roman"/>
+          <w:kern w:val="0"/>
+          <w:sz w:val="21"/>
+          <w:szCs w:val="21"/>
+          <w14:ligatures w14:val="none"/>
+        </w:rPr>
+        <w:t>launch-wizard-1</w:t>
+      </w:r>
+      <w:r>
+        <w:rPr>
+          <w:rFonts w:ascii="Consolas" w:eastAsia="Times New Roman" w:hAnsi="Consolas" w:cs="Times New Roman"/>
+          <w:kern w:val="0"/>
+          <w:sz w:val="21"/>
+          <w:szCs w:val="21"/>
+          <w14:ligatures w14:val="none"/>
+        </w:rPr>
+        <w:t>’</w:t>
+      </w:r>
+      <w:r>
+        <w:rPr>
+          <w:rFonts w:ascii="Consolas" w:eastAsia="Times New Roman" w:hAnsi="Consolas" w:cs="Times New Roman"/>
+          <w:kern w:val="0"/>
+          <w:sz w:val="21"/>
+          <w:szCs w:val="21"/>
+          <w14:ligatures w14:val="none"/>
+        </w:rPr>
+        <w:t xml:space="preserve"> </w:t>
+      </w:r>
+      <w:r>
+        <w:rPr>
+          <w:rFonts w:ascii="Consolas" w:eastAsia="Times New Roman" w:hAnsi="Consolas" w:cs="Times New Roman"/>
+          <w:kern w:val="0"/>
+          <w:sz w:val="21"/>
+          <w:szCs w:val="21"/>
+          <w14:ligatures w14:val="none"/>
+        </w:rPr>
+        <w:t>group – edit inbound rules – add rule : custom TCP TCP 5000 0.0.0.0/0</w:t>
       </w:r>
       <w:r>
         <w:rPr>
@@ -32692,18 +33869,27 @@
           <w14:ligatures w14:val="none"/>
         </w:rPr>
         <w:br/>
-        <w:t>now it perfectly run on elastic-ip:port</w:t>
-      </w:r>
-      <w:r>
-        <w:rPr>
-          <w:rFonts w:ascii="Consolas" w:eastAsia="Times New Roman" w:hAnsi="Consolas" w:cs="Times New Roman"/>
-          <w:kern w:val="0"/>
-          <w:sz w:val="21"/>
-          <w:szCs w:val="21"/>
-          <w14:ligatures w14:val="none"/>
-        </w:rPr>
-        <w:tab/>
-        <w:t>perfectly.</w:t>
+        <w:t xml:space="preserve">now </w:t>
+      </w:r>
+      <w:r>
+        <w:rPr>
+          <w:rFonts w:ascii="Consolas" w:eastAsia="Times New Roman" w:hAnsi="Consolas" w:cs="Times New Roman"/>
+          <w:kern w:val="0"/>
+          <w:sz w:val="21"/>
+          <w:szCs w:val="21"/>
+          <w14:ligatures w14:val="none"/>
+        </w:rPr>
+        <w:t>server is live you can access it on browser</w:t>
+      </w:r>
+      <w:r>
+        <w:rPr>
+          <w:rFonts w:ascii="Consolas" w:eastAsia="Times New Roman" w:hAnsi="Consolas" w:cs="Times New Roman"/>
+          <w:kern w:val="0"/>
+          <w:sz w:val="21"/>
+          <w:szCs w:val="21"/>
+          <w14:ligatures w14:val="none"/>
+        </w:rPr>
+        <w:t xml:space="preserve"> </w:t>
       </w:r>
       <w:r>
         <w:rPr>
@@ -32714,6 +33900,77 @@
           <w14:ligatures w14:val="none"/>
         </w:rPr>
         <w:br/>
+        <w:t>http://your-</w:t>
+      </w:r>
+      <w:r>
+        <w:rPr>
+          <w:rFonts w:ascii="Consolas" w:eastAsia="Times New Roman" w:hAnsi="Consolas" w:cs="Times New Roman"/>
+          <w:kern w:val="0"/>
+          <w:sz w:val="21"/>
+          <w:szCs w:val="21"/>
+          <w14:ligatures w14:val="none"/>
+        </w:rPr>
+        <w:t>elastic-ip:por</w:t>
+      </w:r>
+      <w:r>
+        <w:rPr>
+          <w:rFonts w:ascii="Consolas" w:eastAsia="Times New Roman" w:hAnsi="Consolas" w:cs="Times New Roman"/>
+          <w:kern w:val="0"/>
+          <w:sz w:val="21"/>
+          <w:szCs w:val="21"/>
+          <w14:ligatures w14:val="none"/>
+        </w:rPr>
+        <w:t>t</w:t>
+      </w:r>
+      <w:r>
+        <w:rPr>
+          <w:rFonts w:ascii="Consolas" w:eastAsia="Times New Roman" w:hAnsi="Consolas" w:cs="Times New Roman"/>
+          <w:kern w:val="0"/>
+          <w:sz w:val="21"/>
+          <w:szCs w:val="21"/>
+          <w14:ligatures w14:val="none"/>
+        </w:rPr>
+        <w:br/>
+      </w:r>
+      <w:r>
+        <w:rPr>
+          <w:rFonts w:ascii="Consolas" w:eastAsia="Times New Roman" w:hAnsi="Consolas" w:cs="Times New Roman"/>
+          <w:kern w:val="0"/>
+          <w:sz w:val="21"/>
+          <w:szCs w:val="21"/>
+          <w14:ligatures w14:val="none"/>
+        </w:rPr>
+        <w:t>a</w:t>
+      </w:r>
+      <w:r>
+        <w:rPr>
+          <w:rFonts w:ascii="Consolas" w:eastAsia="Times New Roman" w:hAnsi="Consolas" w:cs="Times New Roman"/>
+          <w:kern w:val="0"/>
+          <w:sz w:val="21"/>
+          <w:szCs w:val="21"/>
+          <w14:ligatures w14:val="none"/>
+        </w:rPr>
+        <w:t>t end stop instance to stop cost - goto EC2</w:t>
+      </w:r>
+      <w:r>
+        <w:rPr>
+          <w:rFonts w:ascii="Consolas" w:eastAsia="Times New Roman" w:hAnsi="Consolas" w:cs="Times New Roman"/>
+          <w:kern w:val="0"/>
+          <w:sz w:val="21"/>
+          <w:szCs w:val="21"/>
+          <w14:ligatures w14:val="none"/>
+        </w:rPr>
+        <w:t xml:space="preserve"> – instances – instance state - stop instance </w:t>
+      </w:r>
+      <w:r>
+        <w:rPr>
+          <w:rFonts w:ascii="Consolas" w:eastAsia="Times New Roman" w:hAnsi="Consolas" w:cs="Times New Roman"/>
+          <w:kern w:val="0"/>
+          <w:sz w:val="21"/>
+          <w:szCs w:val="21"/>
+          <w14:ligatures w14:val="none"/>
+        </w:rPr>
+        <w:t>.</w:t>
       </w:r>
     </w:p>
     <w:p>
@@ -32728,15 +33985,28 @@
           <w14:ligatures w14:val="none"/>
         </w:rPr>
       </w:pPr>
-      <w:r>
-        <w:rPr>
-          <w:rFonts w:ascii="Consolas" w:eastAsia="Times New Roman" w:hAnsi="Consolas" w:cs="Times New Roman"/>
-          <w:kern w:val="0"/>
-          <w:sz w:val="21"/>
-          <w:szCs w:val="21"/>
-          <w14:ligatures w14:val="none"/>
-        </w:rPr>
-        <w:t>=============================== CI/CD</w:t>
+    </w:p>
+    <w:p>
+      <w:pPr>
+        <w:pStyle w:val="ListParagraph"/>
+        <w:spacing w:after="0" w:line="285" w:lineRule="atLeast"/>
+        <w:rPr>
+          <w:rFonts w:ascii="Consolas" w:eastAsia="Times New Roman" w:hAnsi="Consolas" w:cs="Times New Roman"/>
+          <w:kern w:val="0"/>
+          <w:sz w:val="21"/>
+          <w:szCs w:val="21"/>
+          <w14:ligatures w14:val="none"/>
+        </w:rPr>
+      </w:pPr>
+      <w:r>
+        <w:rPr>
+          <w:rFonts w:ascii="Consolas" w:eastAsia="Times New Roman" w:hAnsi="Consolas" w:cs="Times New Roman"/>
+          <w:kern w:val="0"/>
+          <w:sz w:val="21"/>
+          <w:szCs w:val="21"/>
+          <w14:ligatures w14:val="none"/>
+        </w:rPr>
+        <w:t>============================= CI/CD</w:t>
       </w:r>
       <w:r>
         <w:rPr>
@@ -32786,7 +34056,27 @@
           <w:szCs w:val="21"/>
           <w14:ligatures w14:val="none"/>
         </w:rPr>
-        <w:t xml:space="preserve"> ===============</w:t>
+        <w:t xml:space="preserve"> ====</w:t>
+      </w:r>
+      <w:r>
+        <w:rPr>
+          <w:rFonts w:ascii="Consolas" w:eastAsia="Times New Roman" w:hAnsi="Consolas" w:cs="Times New Roman"/>
+          <w:kern w:val="0"/>
+          <w:sz w:val="21"/>
+          <w:szCs w:val="21"/>
+          <w14:ligatures w14:val="none"/>
+        </w:rPr>
+        <w:t>==</w:t>
+      </w:r>
+      <w:r>
+        <w:rPr>
+          <w:rFonts w:ascii="Consolas" w:eastAsia="Times New Roman" w:hAnsi="Consolas" w:cs="Times New Roman"/>
+          <w:kern w:val="0"/>
+          <w:sz w:val="21"/>
+          <w:szCs w:val="21"/>
+          <w14:ligatures w14:val="none"/>
+        </w:rPr>
+        <w:t>===========</w:t>
       </w:r>
     </w:p>
     <w:p>
@@ -32851,6 +34141,17 @@
           <w14:ligatures w14:val="none"/>
         </w:rPr>
         <w:br/>
+        <w:t>git push – git pull – docker stop cont_name – docker build -it img-name</w:t>
+      </w:r>
+      <w:r>
+        <w:rPr>
+          <w:rFonts w:ascii="Consolas" w:eastAsia="Times New Roman" w:hAnsi="Consolas" w:cs="Times New Roman"/>
+          <w:kern w:val="0"/>
+          <w:sz w:val="21"/>
+          <w:szCs w:val="21"/>
+          <w14:ligatures w14:val="none"/>
+        </w:rPr>
+        <w:br/>
       </w:r>
       <w:r>
         <w:rPr>
@@ -32891,7 +34192,7 @@
           <w:szCs w:val="21"/>
           <w14:ligatures w14:val="none"/>
         </w:rPr>
-        <w:t xml:space="preserve"> Note: stop instances if not used because it cost us.</w:t>
+        <w:t xml:space="preserve"> </w:t>
       </w:r>
       <w:r>
         <w:rPr>
@@ -32924,11 +34225,10 @@
           <w:szCs w:val="21"/>
           <w14:ligatures w14:val="none"/>
         </w:rPr>
-        <w:lastRenderedPageBreak/>
         <w:drawing>
-          <wp:inline distT="0" distB="0" distL="0" distR="0" wp14:anchorId="0C20BD2C" wp14:editId="700AB271">
-            <wp:extent cx="2062716" cy="2926080"/>
-            <wp:effectExtent l="0" t="0" r="0" b="7620"/>
+          <wp:inline distT="0" distB="0" distL="0" distR="0" wp14:anchorId="0C20BD2C" wp14:editId="4F2275B8">
+            <wp:extent cx="1828800" cy="2594256"/>
+            <wp:effectExtent l="0" t="0" r="0" b="0"/>
             <wp:docPr id="1207755877" name="Picture 1"/>
             <wp:cNvGraphicFramePr>
               <a:graphicFrameLocks xmlns:a="http://schemas.openxmlformats.org/drawingml/2006/main" noChangeAspect="1"/>
@@ -32941,7 +34241,7 @@
                     <pic:cNvPicPr/>
                   </pic:nvPicPr>
                   <pic:blipFill rotWithShape="1">
-                    <a:blip r:embed="rId33"/>
+                    <a:blip r:embed="rId35"/>
                     <a:srcRect r="29959"/>
                     <a:stretch>
                       <a:fillRect/>
@@ -32950,7 +34250,7 @@
                   <pic:spPr bwMode="auto">
                     <a:xfrm>
                       <a:off x="0" y="0"/>
-                      <a:ext cx="2067136" cy="2932350"/>
+                      <a:ext cx="1838248" cy="2607658"/>
                     </a:xfrm>
                     <a:prstGeom prst="rect">
                       <a:avLst/>
@@ -32990,9 +34290,9 @@
           <w14:ligatures w14:val="none"/>
         </w:rPr>
         <w:drawing>
-          <wp:inline distT="0" distB="0" distL="0" distR="0" wp14:anchorId="5971FFF4" wp14:editId="1E34704D">
-            <wp:extent cx="3730315" cy="2912806"/>
-            <wp:effectExtent l="0" t="0" r="3810" b="1905"/>
+          <wp:inline distT="0" distB="0" distL="0" distR="0" wp14:anchorId="5971FFF4" wp14:editId="3D6F83A6">
+            <wp:extent cx="2851697" cy="2226740"/>
+            <wp:effectExtent l="0" t="0" r="6350" b="2540"/>
             <wp:docPr id="866989966" name="Picture 1"/>
             <wp:cNvGraphicFramePr>
               <a:graphicFrameLocks xmlns:a="http://schemas.openxmlformats.org/drawingml/2006/main" noChangeAspect="1"/>
@@ -33005,7 +34305,7 @@
                     <pic:cNvPicPr/>
                   </pic:nvPicPr>
                   <pic:blipFill>
-                    <a:blip r:embed="rId34"/>
+                    <a:blip r:embed="rId36"/>
                     <a:stretch>
                       <a:fillRect/>
                     </a:stretch>
@@ -33013,7 +34313,7 @@
                   <pic:spPr>
                     <a:xfrm>
                       <a:off x="0" y="0"/>
-                      <a:ext cx="3743189" cy="2922859"/>
+                      <a:ext cx="2887325" cy="2254560"/>
                     </a:xfrm>
                     <a:prstGeom prst="rect">
                       <a:avLst/>
@@ -33031,25 +34331,93 @@
         <w:spacing w:after="0" w:line="285" w:lineRule="atLeast"/>
         <w:rPr>
           <w:rFonts w:ascii="Consolas" w:eastAsia="Times New Roman" w:hAnsi="Consolas" w:cs="Times New Roman"/>
-          <w:kern w:val="0"/>
-          <w:sz w:val="21"/>
-          <w:szCs w:val="21"/>
-          <w14:ligatures w14:val="none"/>
-        </w:rPr>
-      </w:pPr>
-      <w:r>
-        <w:rPr>
-          <w:rFonts w:ascii="Consolas" w:eastAsia="Times New Roman" w:hAnsi="Consolas" w:cs="Times New Roman"/>
           <w:noProof/>
           <w:kern w:val="0"/>
           <w:sz w:val="21"/>
           <w:szCs w:val="21"/>
           <w14:ligatures w14:val="none"/>
         </w:rPr>
+      </w:pPr>
+    </w:p>
+    <w:p>
+      <w:pPr>
+        <w:spacing w:after="0" w:line="285" w:lineRule="atLeast"/>
+        <w:rPr>
+          <w:rFonts w:ascii="Consolas" w:eastAsia="Times New Roman" w:hAnsi="Consolas" w:cs="Times New Roman"/>
+          <w:noProof/>
+          <w:kern w:val="0"/>
+          <w:sz w:val="21"/>
+          <w:szCs w:val="21"/>
+          <w14:ligatures w14:val="none"/>
+        </w:rPr>
+      </w:pPr>
+      <w:r>
+        <w:rPr>
+          <w:rFonts w:ascii="Consolas" w:eastAsia="Times New Roman" w:hAnsi="Consolas" w:cs="Times New Roman"/>
+          <w:noProof/>
+          <w:kern w:val="0"/>
+          <w:sz w:val="21"/>
+          <w:szCs w:val="21"/>
+          <w14:ligatures w14:val="none"/>
+        </w:rPr>
         <w:drawing>
-          <wp:inline distT="0" distB="0" distL="0" distR="0" wp14:anchorId="7A5E751E" wp14:editId="6D4D9FD1">
-            <wp:extent cx="1754944" cy="4284126"/>
-            <wp:effectExtent l="0" t="0" r="0" b="2540"/>
+          <wp:inline distT="0" distB="0" distL="0" distR="0" wp14:anchorId="46AA6C59" wp14:editId="3DD5A2DF">
+            <wp:extent cx="1542553" cy="2111207"/>
+            <wp:effectExtent l="0" t="0" r="635" b="3810"/>
+            <wp:docPr id="419799826" name="Picture 1"/>
+            <wp:cNvGraphicFramePr>
+              <a:graphicFrameLocks xmlns:a="http://schemas.openxmlformats.org/drawingml/2006/main" noChangeAspect="1"/>
+            </wp:cNvGraphicFramePr>
+            <a:graphic xmlns:a="http://schemas.openxmlformats.org/drawingml/2006/main">
+              <a:graphicData uri="http://schemas.openxmlformats.org/drawingml/2006/picture">
+                <pic:pic xmlns:pic="http://schemas.openxmlformats.org/drawingml/2006/picture">
+                  <pic:nvPicPr>
+                    <pic:cNvPr id="42510827" name=""/>
+                    <pic:cNvPicPr/>
+                  </pic:nvPicPr>
+                  <pic:blipFill rotWithShape="1">
+                    <a:blip r:embed="rId37"/>
+                    <a:srcRect b="43935"/>
+                    <a:stretch>
+                      <a:fillRect/>
+                    </a:stretch>
+                  </pic:blipFill>
+                  <pic:spPr bwMode="auto">
+                    <a:xfrm>
+                      <a:off x="0" y="0"/>
+                      <a:ext cx="1576424" cy="2157564"/>
+                    </a:xfrm>
+                    <a:prstGeom prst="rect">
+                      <a:avLst/>
+                    </a:prstGeom>
+                    <a:ln>
+                      <a:noFill/>
+                    </a:ln>
+                    <a:extLst>
+                      <a:ext uri="{53640926-AAD7-44D8-BBD7-CCE9431645EC}">
+                        <a14:shadowObscured xmlns:a14="http://schemas.microsoft.com/office/drawing/2010/main"/>
+                      </a:ext>
+                    </a:extLst>
+                  </pic:spPr>
+                </pic:pic>
+              </a:graphicData>
+            </a:graphic>
+          </wp:inline>
+        </w:drawing>
+      </w:r>
+      <w:r>
+        <w:rPr>
+          <w:rFonts w:ascii="Consolas" w:eastAsia="Times New Roman" w:hAnsi="Consolas" w:cs="Times New Roman"/>
+          <w:noProof/>
+          <w:kern w:val="0"/>
+          <w:sz w:val="21"/>
+          <w:szCs w:val="21"/>
+          <w14:ligatures w14:val="none"/>
+        </w:rPr>
+        <w:drawing>
+          <wp:inline distT="0" distB="0" distL="0" distR="0" wp14:anchorId="4F1CCD3C" wp14:editId="3FDA76AE">
+            <wp:extent cx="1927209" cy="1682694"/>
+            <wp:effectExtent l="0" t="0" r="0" b="0"/>
             <wp:docPr id="42510827" name="Picture 1"/>
             <wp:cNvGraphicFramePr>
               <a:graphicFrameLocks xmlns:a="http://schemas.openxmlformats.org/drawingml/2006/main" noChangeAspect="1"/>
@@ -33061,20 +34429,29 @@
                     <pic:cNvPr id="42510827" name=""/>
                     <pic:cNvPicPr/>
                   </pic:nvPicPr>
-                  <pic:blipFill>
-                    <a:blip r:embed="rId35"/>
+                  <pic:blipFill rotWithShape="1">
+                    <a:blip r:embed="rId37"/>
+                    <a:srcRect t="64233"/>
                     <a:stretch>
                       <a:fillRect/>
                     </a:stretch>
                   </pic:blipFill>
-                  <pic:spPr>
+                  <pic:spPr bwMode="auto">
                     <a:xfrm>
                       <a:off x="0" y="0"/>
-                      <a:ext cx="1773121" cy="4328498"/>
+                      <a:ext cx="1949076" cy="1701787"/>
                     </a:xfrm>
                     <a:prstGeom prst="rect">
                       <a:avLst/>
                     </a:prstGeom>
+                    <a:ln>
+                      <a:noFill/>
+                    </a:ln>
+                    <a:extLst>
+                      <a:ext uri="{53640926-AAD7-44D8-BBD7-CCE9431645EC}">
+                        <a14:shadowObscured xmlns:a14="http://schemas.microsoft.com/office/drawing/2010/main"/>
+                      </a:ext>
+                    </a:extLst>
                   </pic:spPr>
                 </pic:pic>
               </a:graphicData>
@@ -33092,9 +34469,9 @@
           <w14:ligatures w14:val="none"/>
         </w:rPr>
         <w:drawing>
-          <wp:inline distT="0" distB="0" distL="0" distR="0" wp14:anchorId="26555B79" wp14:editId="434E6403">
-            <wp:extent cx="1488693" cy="1765004"/>
-            <wp:effectExtent l="0" t="0" r="0" b="6985"/>
+          <wp:inline distT="0" distB="0" distL="0" distR="0" wp14:anchorId="45511AEC" wp14:editId="31A52AC9">
+            <wp:extent cx="1614114" cy="1913705"/>
+            <wp:effectExtent l="0" t="0" r="5715" b="0"/>
             <wp:docPr id="1642469972" name="Picture 1"/>
             <wp:cNvGraphicFramePr>
               <a:graphicFrameLocks xmlns:a="http://schemas.openxmlformats.org/drawingml/2006/main" noChangeAspect="1"/>
@@ -33107,7 +34484,7 @@
                     <pic:cNvPicPr/>
                   </pic:nvPicPr>
                   <pic:blipFill>
-                    <a:blip r:embed="rId36"/>
+                    <a:blip r:embed="rId38"/>
                     <a:stretch>
                       <a:fillRect/>
                     </a:stretch>
@@ -33115,7 +34492,7 @@
                   <pic:spPr>
                     <a:xfrm>
                       <a:off x="0" y="0"/>
-                      <a:ext cx="1508660" cy="1788678"/>
+                      <a:ext cx="1637691" cy="1941659"/>
                     </a:xfrm>
                     <a:prstGeom prst="rect">
                       <a:avLst/>
@@ -33127,51 +34504,6 @@
           </wp:inline>
         </w:drawing>
       </w:r>
-      <w:r>
-        <w:rPr>
-          <w:rFonts w:ascii="Consolas" w:eastAsia="Times New Roman" w:hAnsi="Consolas" w:cs="Times New Roman"/>
-          <w:noProof/>
-          <w:kern w:val="0"/>
-          <w:sz w:val="21"/>
-          <w:szCs w:val="21"/>
-          <w14:ligatures w14:val="none"/>
-        </w:rPr>
-        <w:drawing>
-          <wp:inline distT="0" distB="0" distL="0" distR="0" wp14:anchorId="685C9825" wp14:editId="6F614586">
-            <wp:extent cx="2658140" cy="4832208"/>
-            <wp:effectExtent l="0" t="0" r="8890" b="6985"/>
-            <wp:docPr id="1716466167" name="Picture 1"/>
-            <wp:cNvGraphicFramePr>
-              <a:graphicFrameLocks xmlns:a="http://schemas.openxmlformats.org/drawingml/2006/main" noChangeAspect="1"/>
-            </wp:cNvGraphicFramePr>
-            <a:graphic xmlns:a="http://schemas.openxmlformats.org/drawingml/2006/main">
-              <a:graphicData uri="http://schemas.openxmlformats.org/drawingml/2006/picture">
-                <pic:pic xmlns:pic="http://schemas.openxmlformats.org/drawingml/2006/picture">
-                  <pic:nvPicPr>
-                    <pic:cNvPr id="1716466167" name=""/>
-                    <pic:cNvPicPr/>
-                  </pic:nvPicPr>
-                  <pic:blipFill>
-                    <a:blip r:embed="rId37"/>
-                    <a:stretch>
-                      <a:fillRect/>
-                    </a:stretch>
-                  </pic:blipFill>
-                  <pic:spPr>
-                    <a:xfrm>
-                      <a:off x="0" y="0"/>
-                      <a:ext cx="2665024" cy="4844722"/>
-                    </a:xfrm>
-                    <a:prstGeom prst="rect">
-                      <a:avLst/>
-                    </a:prstGeom>
-                  </pic:spPr>
-                </pic:pic>
-              </a:graphicData>
-            </a:graphic>
-          </wp:inline>
-        </w:drawing>
-      </w:r>
     </w:p>
     <w:p>
       <w:pPr>
@@ -33185,6 +34517,1885 @@
           <w14:ligatures w14:val="none"/>
         </w:rPr>
       </w:pPr>
+      <w:r>
+        <w:rPr>
+          <w:rFonts w:ascii="Consolas" w:eastAsia="Times New Roman" w:hAnsi="Consolas" w:cs="Times New Roman"/>
+          <w:kern w:val="0"/>
+          <w:sz w:val="21"/>
+          <w:szCs w:val="21"/>
+          <w14:ligatures w14:val="none"/>
+        </w:rPr>
+        <w:lastRenderedPageBreak/>
+        <w:t>Github action is deploy.yml file ko use kry ga or jb hm code new changes push kreingy, github action onhein auto deploy kr dy ga ya jo action mentioned hoga .yml file ma osy perform kry ga.</w:t>
+      </w:r>
+    </w:p>
+    <w:p>
+      <w:pPr>
+        <w:spacing w:after="0" w:line="285" w:lineRule="atLeast"/>
+        <w:rPr>
+          <w:rFonts w:ascii="Consolas" w:eastAsia="Times New Roman" w:hAnsi="Consolas" w:cs="Times New Roman"/>
+          <w:kern w:val="0"/>
+          <w:sz w:val="21"/>
+          <w:szCs w:val="21"/>
+          <w14:ligatures w14:val="none"/>
+        </w:rPr>
+      </w:pPr>
+      <w:r>
+        <w:rPr>
+          <w:rFonts w:ascii="Consolas" w:eastAsia="Times New Roman" w:hAnsi="Consolas" w:cs="Times New Roman"/>
+          <w:kern w:val="0"/>
+          <w:sz w:val="21"/>
+          <w:szCs w:val="21"/>
+          <w14:ligatures w14:val="none"/>
+        </w:rPr>
+        <w:t>Level5/.dockerignore</w:t>
+      </w:r>
+    </w:p>
+    <w:p>
+      <w:pPr>
+        <w:spacing w:after="0" w:line="285" w:lineRule="atLeast"/>
+        <w:rPr>
+          <w:rFonts w:ascii="Consolas" w:eastAsia="Times New Roman" w:hAnsi="Consolas" w:cs="Times New Roman"/>
+          <w:kern w:val="0"/>
+          <w:sz w:val="21"/>
+          <w:szCs w:val="21"/>
+          <w14:ligatures w14:val="none"/>
+        </w:rPr>
+      </w:pPr>
+      <w:r>
+        <w:rPr>
+          <w:rFonts w:ascii="Consolas" w:eastAsia="Times New Roman" w:hAnsi="Consolas" w:cs="Times New Roman"/>
+          <w:kern w:val="0"/>
+          <w:sz w:val="21"/>
+          <w:szCs w:val="21"/>
+          <w14:ligatures w14:val="none"/>
+        </w:rPr>
+        <w:t>Level5/docker-compose.yml</w:t>
+      </w:r>
+    </w:p>
+    <w:p>
+      <w:pPr>
+        <w:shd w:val="clear" w:color="auto" w:fill="23272E"/>
+        <w:spacing w:after="0" w:line="285" w:lineRule="atLeast"/>
+        <w:rPr>
+          <w:rFonts w:ascii="Consolas" w:eastAsia="Times New Roman" w:hAnsi="Consolas" w:cs="Times New Roman"/>
+          <w:color w:val="ABB2BF"/>
+          <w:kern w:val="0"/>
+          <w:sz w:val="21"/>
+          <w:szCs w:val="21"/>
+          <w14:ligatures w14:val="none"/>
+        </w:rPr>
+      </w:pPr>
+      <w:r>
+        <w:rPr>
+          <w:rFonts w:ascii="Consolas" w:eastAsia="Times New Roman" w:hAnsi="Consolas" w:cs="Times New Roman"/>
+          <w:color w:val="E06C75"/>
+          <w:kern w:val="0"/>
+          <w:sz w:val="21"/>
+          <w:szCs w:val="21"/>
+          <w14:ligatures w14:val="none"/>
+        </w:rPr>
+        <w:t>services</w:t>
+      </w:r>
+      <w:r>
+        <w:rPr>
+          <w:rFonts w:ascii="Consolas" w:eastAsia="Times New Roman" w:hAnsi="Consolas" w:cs="Times New Roman"/>
+          <w:color w:val="ABB2BF"/>
+          <w:kern w:val="0"/>
+          <w:sz w:val="21"/>
+          <w:szCs w:val="21"/>
+          <w14:ligatures w14:val="none"/>
+        </w:rPr>
+        <w:t>:</w:t>
+      </w:r>
+    </w:p>
+    <w:p>
+      <w:pPr>
+        <w:shd w:val="clear" w:color="auto" w:fill="23272E"/>
+        <w:spacing w:after="0" w:line="285" w:lineRule="atLeast"/>
+        <w:rPr>
+          <w:rFonts w:ascii="Consolas" w:eastAsia="Times New Roman" w:hAnsi="Consolas" w:cs="Times New Roman"/>
+          <w:color w:val="ABB2BF"/>
+          <w:kern w:val="0"/>
+          <w:sz w:val="21"/>
+          <w:szCs w:val="21"/>
+          <w14:ligatures w14:val="none"/>
+        </w:rPr>
+      </w:pPr>
+      <w:r>
+        <w:rPr>
+          <w:rFonts w:ascii="Consolas" w:eastAsia="Times New Roman" w:hAnsi="Consolas" w:cs="Times New Roman"/>
+          <w:color w:val="ABB2BF"/>
+          <w:kern w:val="0"/>
+          <w:sz w:val="21"/>
+          <w:szCs w:val="21"/>
+          <w14:ligatures w14:val="none"/>
+        </w:rPr>
+        <w:t xml:space="preserve">  </w:t>
+      </w:r>
+      <w:r>
+        <w:rPr>
+          <w:rFonts w:ascii="Consolas" w:eastAsia="Times New Roman" w:hAnsi="Consolas" w:cs="Times New Roman"/>
+          <w:color w:val="E06C75"/>
+          <w:kern w:val="0"/>
+          <w:sz w:val="21"/>
+          <w:szCs w:val="21"/>
+          <w14:ligatures w14:val="none"/>
+        </w:rPr>
+        <w:t>level5</w:t>
+      </w:r>
+      <w:r>
+        <w:rPr>
+          <w:rFonts w:ascii="Consolas" w:eastAsia="Times New Roman" w:hAnsi="Consolas" w:cs="Times New Roman"/>
+          <w:color w:val="ABB2BF"/>
+          <w:kern w:val="0"/>
+          <w:sz w:val="21"/>
+          <w:szCs w:val="21"/>
+          <w14:ligatures w14:val="none"/>
+        </w:rPr>
+        <w:t>:</w:t>
+      </w:r>
+    </w:p>
+    <w:p>
+      <w:pPr>
+        <w:shd w:val="clear" w:color="auto" w:fill="23272E"/>
+        <w:spacing w:after="0" w:line="285" w:lineRule="atLeast"/>
+        <w:rPr>
+          <w:rFonts w:ascii="Consolas" w:eastAsia="Times New Roman" w:hAnsi="Consolas" w:cs="Times New Roman"/>
+          <w:color w:val="ABB2BF"/>
+          <w:kern w:val="0"/>
+          <w:sz w:val="21"/>
+          <w:szCs w:val="21"/>
+          <w14:ligatures w14:val="none"/>
+        </w:rPr>
+      </w:pPr>
+      <w:r>
+        <w:rPr>
+          <w:rFonts w:ascii="Consolas" w:eastAsia="Times New Roman" w:hAnsi="Consolas" w:cs="Times New Roman"/>
+          <w:color w:val="ABB2BF"/>
+          <w:kern w:val="0"/>
+          <w:sz w:val="21"/>
+          <w:szCs w:val="21"/>
+          <w14:ligatures w14:val="none"/>
+        </w:rPr>
+        <w:t xml:space="preserve">    </w:t>
+      </w:r>
+      <w:r>
+        <w:rPr>
+          <w:rFonts w:ascii="Consolas" w:eastAsia="Times New Roman" w:hAnsi="Consolas" w:cs="Times New Roman"/>
+          <w:color w:val="E06C75"/>
+          <w:kern w:val="0"/>
+          <w:sz w:val="21"/>
+          <w:szCs w:val="21"/>
+          <w14:ligatures w14:val="none"/>
+        </w:rPr>
+        <w:t>build</w:t>
+      </w:r>
+      <w:r>
+        <w:rPr>
+          <w:rFonts w:ascii="Consolas" w:eastAsia="Times New Roman" w:hAnsi="Consolas" w:cs="Times New Roman"/>
+          <w:color w:val="ABB2BF"/>
+          <w:kern w:val="0"/>
+          <w:sz w:val="21"/>
+          <w:szCs w:val="21"/>
+          <w14:ligatures w14:val="none"/>
+        </w:rPr>
+        <w:t xml:space="preserve">: </w:t>
+      </w:r>
+      <w:r>
+        <w:rPr>
+          <w:rFonts w:ascii="Consolas" w:eastAsia="Times New Roman" w:hAnsi="Consolas" w:cs="Times New Roman"/>
+          <w:color w:val="98C379"/>
+          <w:kern w:val="0"/>
+          <w:sz w:val="21"/>
+          <w:szCs w:val="21"/>
+          <w14:ligatures w14:val="none"/>
+        </w:rPr>
+        <w:t>./</w:t>
+      </w:r>
+      <w:r>
+        <w:rPr>
+          <w:rFonts w:ascii="Consolas" w:eastAsia="Times New Roman" w:hAnsi="Consolas" w:cs="Times New Roman"/>
+          <w:color w:val="ABB2BF"/>
+          <w:kern w:val="0"/>
+          <w:sz w:val="21"/>
+          <w:szCs w:val="21"/>
+          <w14:ligatures w14:val="none"/>
+        </w:rPr>
+        <w:t xml:space="preserve"> </w:t>
+      </w:r>
+      <w:r>
+        <w:rPr>
+          <w:rFonts w:ascii="Consolas" w:eastAsia="Times New Roman" w:hAnsi="Consolas" w:cs="Times New Roman"/>
+          <w:color w:val="7F848E"/>
+          <w:kern w:val="0"/>
+          <w:sz w:val="21"/>
+          <w:szCs w:val="21"/>
+          <w14:ligatures w14:val="none"/>
+        </w:rPr>
+        <w:t># here wehave custom-dockerfile to create container</w:t>
+      </w:r>
+    </w:p>
+    <w:p>
+      <w:pPr>
+        <w:shd w:val="clear" w:color="auto" w:fill="23272E"/>
+        <w:spacing w:after="0" w:line="285" w:lineRule="atLeast"/>
+        <w:rPr>
+          <w:rFonts w:ascii="Consolas" w:eastAsia="Times New Roman" w:hAnsi="Consolas" w:cs="Times New Roman"/>
+          <w:color w:val="ABB2BF"/>
+          <w:kern w:val="0"/>
+          <w:sz w:val="21"/>
+          <w:szCs w:val="21"/>
+          <w14:ligatures w14:val="none"/>
+        </w:rPr>
+      </w:pPr>
+      <w:r>
+        <w:rPr>
+          <w:rFonts w:ascii="Consolas" w:eastAsia="Times New Roman" w:hAnsi="Consolas" w:cs="Times New Roman"/>
+          <w:color w:val="ABB2BF"/>
+          <w:kern w:val="0"/>
+          <w:sz w:val="21"/>
+          <w:szCs w:val="21"/>
+          <w14:ligatures w14:val="none"/>
+        </w:rPr>
+        <w:t xml:space="preserve">    </w:t>
+      </w:r>
+      <w:r>
+        <w:rPr>
+          <w:rFonts w:ascii="Consolas" w:eastAsia="Times New Roman" w:hAnsi="Consolas" w:cs="Times New Roman"/>
+          <w:color w:val="E06C75"/>
+          <w:kern w:val="0"/>
+          <w:sz w:val="21"/>
+          <w:szCs w:val="21"/>
+          <w14:ligatures w14:val="none"/>
+        </w:rPr>
+        <w:t>ports</w:t>
+      </w:r>
+      <w:r>
+        <w:rPr>
+          <w:rFonts w:ascii="Consolas" w:eastAsia="Times New Roman" w:hAnsi="Consolas" w:cs="Times New Roman"/>
+          <w:color w:val="ABB2BF"/>
+          <w:kern w:val="0"/>
+          <w:sz w:val="21"/>
+          <w:szCs w:val="21"/>
+          <w14:ligatures w14:val="none"/>
+        </w:rPr>
+        <w:t>:</w:t>
+      </w:r>
+    </w:p>
+    <w:p>
+      <w:pPr>
+        <w:shd w:val="clear" w:color="auto" w:fill="23272E"/>
+        <w:spacing w:after="0" w:line="285" w:lineRule="atLeast"/>
+        <w:rPr>
+          <w:rFonts w:ascii="Consolas" w:eastAsia="Times New Roman" w:hAnsi="Consolas" w:cs="Times New Roman"/>
+          <w:color w:val="ABB2BF"/>
+          <w:kern w:val="0"/>
+          <w:sz w:val="21"/>
+          <w:szCs w:val="21"/>
+          <w14:ligatures w14:val="none"/>
+        </w:rPr>
+      </w:pPr>
+      <w:r>
+        <w:rPr>
+          <w:rFonts w:ascii="Consolas" w:eastAsia="Times New Roman" w:hAnsi="Consolas" w:cs="Times New Roman"/>
+          <w:color w:val="ABB2BF"/>
+          <w:kern w:val="0"/>
+          <w:sz w:val="21"/>
+          <w:szCs w:val="21"/>
+          <w14:ligatures w14:val="none"/>
+        </w:rPr>
+        <w:t xml:space="preserve">      - </w:t>
+      </w:r>
+      <w:r>
+        <w:rPr>
+          <w:rFonts w:ascii="Consolas" w:eastAsia="Times New Roman" w:hAnsi="Consolas" w:cs="Times New Roman"/>
+          <w:color w:val="98C379"/>
+          <w:kern w:val="0"/>
+          <w:sz w:val="21"/>
+          <w:szCs w:val="21"/>
+          <w14:ligatures w14:val="none"/>
+        </w:rPr>
+        <w:t>5000:5000</w:t>
+      </w:r>
+    </w:p>
+    <w:p>
+      <w:pPr>
+        <w:spacing w:after="0" w:line="285" w:lineRule="atLeast"/>
+        <w:rPr>
+          <w:rFonts w:ascii="Consolas" w:eastAsia="Times New Roman" w:hAnsi="Consolas" w:cs="Times New Roman"/>
+          <w:kern w:val="0"/>
+          <w:sz w:val="21"/>
+          <w:szCs w:val="21"/>
+          <w14:ligatures w14:val="none"/>
+        </w:rPr>
+      </w:pPr>
+    </w:p>
+    <w:p>
+      <w:pPr>
+        <w:spacing w:after="0" w:line="285" w:lineRule="atLeast"/>
+        <w:rPr>
+          <w:rFonts w:ascii="Consolas" w:eastAsia="Times New Roman" w:hAnsi="Consolas" w:cs="Times New Roman"/>
+          <w:kern w:val="0"/>
+          <w:sz w:val="21"/>
+          <w:szCs w:val="21"/>
+          <w14:ligatures w14:val="none"/>
+        </w:rPr>
+      </w:pPr>
+      <w:r>
+        <w:rPr>
+          <w:rFonts w:ascii="Consolas" w:eastAsia="Times New Roman" w:hAnsi="Consolas" w:cs="Times New Roman"/>
+          <w:kern w:val="0"/>
+          <w:sz w:val="21"/>
+          <w:szCs w:val="21"/>
+          <w14:ligatures w14:val="none"/>
+        </w:rPr>
+        <w:t>Level5/d</w:t>
+      </w:r>
+      <w:r>
+        <w:rPr>
+          <w:rFonts w:ascii="Consolas" w:eastAsia="Times New Roman" w:hAnsi="Consolas" w:cs="Times New Roman"/>
+          <w:kern w:val="0"/>
+          <w:sz w:val="21"/>
+          <w:szCs w:val="21"/>
+          <w14:ligatures w14:val="none"/>
+        </w:rPr>
+        <w:t>eploy.yml</w:t>
+      </w:r>
+      <w:r>
+        <w:rPr>
+          <w:rFonts w:ascii="Consolas" w:eastAsia="Times New Roman" w:hAnsi="Consolas" w:cs="Times New Roman"/>
+          <w:kern w:val="0"/>
+          <w:sz w:val="21"/>
+          <w:szCs w:val="21"/>
+          <w14:ligatures w14:val="none"/>
+        </w:rPr>
+        <w:t xml:space="preserve"> //make sure docker-desktop will run in background.</w:t>
+      </w:r>
+      <w:r>
+        <w:rPr>
+          <w:rFonts w:ascii="Consolas" w:eastAsia="Times New Roman" w:hAnsi="Consolas" w:cs="Times New Roman"/>
+          <w:kern w:val="0"/>
+          <w:sz w:val="21"/>
+          <w:szCs w:val="21"/>
+          <w14:ligatures w14:val="none"/>
+        </w:rPr>
+        <w:t xml:space="preserve"> For docker compose up</w:t>
+      </w:r>
+      <w:r>
+        <w:rPr>
+          <w:rFonts w:ascii="Consolas" w:eastAsia="Times New Roman" w:hAnsi="Consolas" w:cs="Times New Roman"/>
+          <w:kern w:val="0"/>
+          <w:sz w:val="21"/>
+          <w:szCs w:val="21"/>
+          <w14:ligatures w14:val="none"/>
+        </w:rPr>
+        <w:t xml:space="preserve"> &amp; down</w:t>
+      </w:r>
+      <w:r>
+        <w:rPr>
+          <w:rFonts w:ascii="Consolas" w:eastAsia="Times New Roman" w:hAnsi="Consolas" w:cs="Times New Roman"/>
+          <w:kern w:val="0"/>
+          <w:sz w:val="21"/>
+          <w:szCs w:val="21"/>
+          <w14:ligatures w14:val="none"/>
+        </w:rPr>
+        <w:t xml:space="preserve"> cmds.</w:t>
+      </w:r>
+    </w:p>
+    <w:p>
+      <w:pPr>
+        <w:shd w:val="clear" w:color="auto" w:fill="23272E"/>
+        <w:spacing w:after="0" w:line="285" w:lineRule="atLeast"/>
+        <w:rPr>
+          <w:rFonts w:ascii="Consolas" w:eastAsia="Times New Roman" w:hAnsi="Consolas" w:cs="Times New Roman"/>
+          <w:color w:val="ABB2BF"/>
+          <w:kern w:val="0"/>
+          <w:sz w:val="21"/>
+          <w:szCs w:val="21"/>
+          <w14:ligatures w14:val="none"/>
+        </w:rPr>
+      </w:pPr>
+      <w:r>
+        <w:rPr>
+          <w:rFonts w:ascii="Consolas" w:eastAsia="Times New Roman" w:hAnsi="Consolas" w:cs="Times New Roman"/>
+          <w:color w:val="E06C75"/>
+          <w:kern w:val="0"/>
+          <w:sz w:val="21"/>
+          <w:szCs w:val="21"/>
+          <w14:ligatures w14:val="none"/>
+        </w:rPr>
+        <w:t>name</w:t>
+      </w:r>
+      <w:r>
+        <w:rPr>
+          <w:rFonts w:ascii="Consolas" w:eastAsia="Times New Roman" w:hAnsi="Consolas" w:cs="Times New Roman"/>
+          <w:color w:val="ABB2BF"/>
+          <w:kern w:val="0"/>
+          <w:sz w:val="21"/>
+          <w:szCs w:val="21"/>
+          <w14:ligatures w14:val="none"/>
+        </w:rPr>
+        <w:t xml:space="preserve">: </w:t>
+      </w:r>
+      <w:r>
+        <w:rPr>
+          <w:rFonts w:ascii="Consolas" w:eastAsia="Times New Roman" w:hAnsi="Consolas" w:cs="Times New Roman"/>
+          <w:color w:val="98C379"/>
+          <w:kern w:val="0"/>
+          <w:sz w:val="21"/>
+          <w:szCs w:val="21"/>
+          <w14:ligatures w14:val="none"/>
+        </w:rPr>
+        <w:t>Deploy To EC2</w:t>
+      </w:r>
+      <w:r>
+        <w:rPr>
+          <w:rFonts w:ascii="Consolas" w:eastAsia="Times New Roman" w:hAnsi="Consolas" w:cs="Times New Roman"/>
+          <w:color w:val="ABB2BF"/>
+          <w:kern w:val="0"/>
+          <w:sz w:val="21"/>
+          <w:szCs w:val="21"/>
+          <w14:ligatures w14:val="none"/>
+        </w:rPr>
+        <w:t xml:space="preserve"> </w:t>
+      </w:r>
+      <w:r>
+        <w:rPr>
+          <w:rFonts w:ascii="Consolas" w:eastAsia="Times New Roman" w:hAnsi="Consolas" w:cs="Times New Roman"/>
+          <w:color w:val="7F848E"/>
+          <w:kern w:val="0"/>
+          <w:sz w:val="21"/>
+          <w:szCs w:val="21"/>
+          <w14:ligatures w14:val="none"/>
+        </w:rPr>
+        <w:t>#action name</w:t>
+      </w:r>
+    </w:p>
+    <w:p>
+      <w:pPr>
+        <w:shd w:val="clear" w:color="auto" w:fill="23272E"/>
+        <w:spacing w:after="0" w:line="285" w:lineRule="atLeast"/>
+        <w:rPr>
+          <w:rFonts w:ascii="Consolas" w:eastAsia="Times New Roman" w:hAnsi="Consolas" w:cs="Times New Roman"/>
+          <w:color w:val="ABB2BF"/>
+          <w:kern w:val="0"/>
+          <w:sz w:val="21"/>
+          <w:szCs w:val="21"/>
+          <w14:ligatures w14:val="none"/>
+        </w:rPr>
+      </w:pPr>
+    </w:p>
+    <w:p>
+      <w:pPr>
+        <w:shd w:val="clear" w:color="auto" w:fill="23272E"/>
+        <w:spacing w:after="0" w:line="285" w:lineRule="atLeast"/>
+        <w:rPr>
+          <w:rFonts w:ascii="Consolas" w:eastAsia="Times New Roman" w:hAnsi="Consolas" w:cs="Times New Roman"/>
+          <w:color w:val="ABB2BF"/>
+          <w:kern w:val="0"/>
+          <w:sz w:val="21"/>
+          <w:szCs w:val="21"/>
+          <w14:ligatures w14:val="none"/>
+        </w:rPr>
+      </w:pPr>
+      <w:r>
+        <w:rPr>
+          <w:rFonts w:ascii="Consolas" w:eastAsia="Times New Roman" w:hAnsi="Consolas" w:cs="Times New Roman"/>
+          <w:color w:val="D19A66"/>
+          <w:kern w:val="0"/>
+          <w:sz w:val="21"/>
+          <w:szCs w:val="21"/>
+          <w14:ligatures w14:val="none"/>
+        </w:rPr>
+        <w:t>on</w:t>
+      </w:r>
+      <w:r>
+        <w:rPr>
+          <w:rFonts w:ascii="Consolas" w:eastAsia="Times New Roman" w:hAnsi="Consolas" w:cs="Times New Roman"/>
+          <w:color w:val="ABB2BF"/>
+          <w:kern w:val="0"/>
+          <w:sz w:val="21"/>
+          <w:szCs w:val="21"/>
+          <w14:ligatures w14:val="none"/>
+        </w:rPr>
+        <w:t xml:space="preserve">: </w:t>
+      </w:r>
+      <w:r>
+        <w:rPr>
+          <w:rFonts w:ascii="Consolas" w:eastAsia="Times New Roman" w:hAnsi="Consolas" w:cs="Times New Roman"/>
+          <w:color w:val="7F848E"/>
+          <w:kern w:val="0"/>
+          <w:sz w:val="21"/>
+          <w:szCs w:val="21"/>
+          <w14:ligatures w14:val="none"/>
+        </w:rPr>
+        <w:t># event on</w:t>
+      </w:r>
+    </w:p>
+    <w:p>
+      <w:pPr>
+        <w:shd w:val="clear" w:color="auto" w:fill="23272E"/>
+        <w:spacing w:after="0" w:line="285" w:lineRule="atLeast"/>
+        <w:rPr>
+          <w:rFonts w:ascii="Consolas" w:eastAsia="Times New Roman" w:hAnsi="Consolas" w:cs="Times New Roman"/>
+          <w:color w:val="ABB2BF"/>
+          <w:kern w:val="0"/>
+          <w:sz w:val="21"/>
+          <w:szCs w:val="21"/>
+          <w14:ligatures w14:val="none"/>
+        </w:rPr>
+      </w:pPr>
+      <w:r>
+        <w:rPr>
+          <w:rFonts w:ascii="Consolas" w:eastAsia="Times New Roman" w:hAnsi="Consolas" w:cs="Times New Roman"/>
+          <w:color w:val="ABB2BF"/>
+          <w:kern w:val="0"/>
+          <w:sz w:val="21"/>
+          <w:szCs w:val="21"/>
+          <w14:ligatures w14:val="none"/>
+        </w:rPr>
+        <w:t xml:space="preserve">  </w:t>
+      </w:r>
+      <w:r>
+        <w:rPr>
+          <w:rFonts w:ascii="Consolas" w:eastAsia="Times New Roman" w:hAnsi="Consolas" w:cs="Times New Roman"/>
+          <w:color w:val="E06C75"/>
+          <w:kern w:val="0"/>
+          <w:sz w:val="21"/>
+          <w:szCs w:val="21"/>
+          <w14:ligatures w14:val="none"/>
+        </w:rPr>
+        <w:t>push</w:t>
+      </w:r>
+      <w:r>
+        <w:rPr>
+          <w:rFonts w:ascii="Consolas" w:eastAsia="Times New Roman" w:hAnsi="Consolas" w:cs="Times New Roman"/>
+          <w:color w:val="ABB2BF"/>
+          <w:kern w:val="0"/>
+          <w:sz w:val="21"/>
+          <w:szCs w:val="21"/>
+          <w14:ligatures w14:val="none"/>
+        </w:rPr>
+        <w:t>:</w:t>
+      </w:r>
+    </w:p>
+    <w:p>
+      <w:pPr>
+        <w:shd w:val="clear" w:color="auto" w:fill="23272E"/>
+        <w:spacing w:after="0" w:line="285" w:lineRule="atLeast"/>
+        <w:rPr>
+          <w:rFonts w:ascii="Consolas" w:eastAsia="Times New Roman" w:hAnsi="Consolas" w:cs="Times New Roman"/>
+          <w:color w:val="ABB2BF"/>
+          <w:kern w:val="0"/>
+          <w:sz w:val="21"/>
+          <w:szCs w:val="21"/>
+          <w14:ligatures w14:val="none"/>
+        </w:rPr>
+      </w:pPr>
+      <w:r>
+        <w:rPr>
+          <w:rFonts w:ascii="Consolas" w:eastAsia="Times New Roman" w:hAnsi="Consolas" w:cs="Times New Roman"/>
+          <w:color w:val="ABB2BF"/>
+          <w:kern w:val="0"/>
+          <w:sz w:val="21"/>
+          <w:szCs w:val="21"/>
+          <w14:ligatures w14:val="none"/>
+        </w:rPr>
+        <w:t xml:space="preserve">    </w:t>
+      </w:r>
+      <w:r>
+        <w:rPr>
+          <w:rFonts w:ascii="Consolas" w:eastAsia="Times New Roman" w:hAnsi="Consolas" w:cs="Times New Roman"/>
+          <w:color w:val="E06C75"/>
+          <w:kern w:val="0"/>
+          <w:sz w:val="21"/>
+          <w:szCs w:val="21"/>
+          <w14:ligatures w14:val="none"/>
+        </w:rPr>
+        <w:t>branches</w:t>
+      </w:r>
+      <w:r>
+        <w:rPr>
+          <w:rFonts w:ascii="Consolas" w:eastAsia="Times New Roman" w:hAnsi="Consolas" w:cs="Times New Roman"/>
+          <w:color w:val="ABB2BF"/>
+          <w:kern w:val="0"/>
+          <w:sz w:val="21"/>
+          <w:szCs w:val="21"/>
+          <w14:ligatures w14:val="none"/>
+        </w:rPr>
+        <w:t>:</w:t>
+      </w:r>
+    </w:p>
+    <w:p>
+      <w:pPr>
+        <w:shd w:val="clear" w:color="auto" w:fill="23272E"/>
+        <w:spacing w:after="0" w:line="285" w:lineRule="atLeast"/>
+        <w:rPr>
+          <w:rFonts w:ascii="Consolas" w:eastAsia="Times New Roman" w:hAnsi="Consolas" w:cs="Times New Roman"/>
+          <w:color w:val="ABB2BF"/>
+          <w:kern w:val="0"/>
+          <w:sz w:val="21"/>
+          <w:szCs w:val="21"/>
+          <w14:ligatures w14:val="none"/>
+        </w:rPr>
+      </w:pPr>
+      <w:r>
+        <w:rPr>
+          <w:rFonts w:ascii="Consolas" w:eastAsia="Times New Roman" w:hAnsi="Consolas" w:cs="Times New Roman"/>
+          <w:color w:val="ABB2BF"/>
+          <w:kern w:val="0"/>
+          <w:sz w:val="21"/>
+          <w:szCs w:val="21"/>
+          <w14:ligatures w14:val="none"/>
+        </w:rPr>
+        <w:t xml:space="preserve">      - </w:t>
+      </w:r>
+      <w:r>
+        <w:rPr>
+          <w:rFonts w:ascii="Consolas" w:eastAsia="Times New Roman" w:hAnsi="Consolas" w:cs="Times New Roman"/>
+          <w:color w:val="98C379"/>
+          <w:kern w:val="0"/>
+          <w:sz w:val="21"/>
+          <w:szCs w:val="21"/>
+          <w14:ligatures w14:val="none"/>
+        </w:rPr>
+        <w:t>main</w:t>
+      </w:r>
+    </w:p>
+    <w:p>
+      <w:pPr>
+        <w:shd w:val="clear" w:color="auto" w:fill="23272E"/>
+        <w:spacing w:after="0" w:line="285" w:lineRule="atLeast"/>
+        <w:rPr>
+          <w:rFonts w:ascii="Consolas" w:eastAsia="Times New Roman" w:hAnsi="Consolas" w:cs="Times New Roman"/>
+          <w:color w:val="ABB2BF"/>
+          <w:kern w:val="0"/>
+          <w:sz w:val="21"/>
+          <w:szCs w:val="21"/>
+          <w14:ligatures w14:val="none"/>
+        </w:rPr>
+      </w:pPr>
+    </w:p>
+    <w:p>
+      <w:pPr>
+        <w:shd w:val="clear" w:color="auto" w:fill="23272E"/>
+        <w:spacing w:after="0" w:line="285" w:lineRule="atLeast"/>
+        <w:rPr>
+          <w:rFonts w:ascii="Consolas" w:eastAsia="Times New Roman" w:hAnsi="Consolas" w:cs="Times New Roman"/>
+          <w:color w:val="ABB2BF"/>
+          <w:kern w:val="0"/>
+          <w:sz w:val="21"/>
+          <w:szCs w:val="21"/>
+          <w14:ligatures w14:val="none"/>
+        </w:rPr>
+      </w:pPr>
+      <w:r>
+        <w:rPr>
+          <w:rFonts w:ascii="Consolas" w:eastAsia="Times New Roman" w:hAnsi="Consolas" w:cs="Times New Roman"/>
+          <w:color w:val="E06C75"/>
+          <w:kern w:val="0"/>
+          <w:sz w:val="21"/>
+          <w:szCs w:val="21"/>
+          <w14:ligatures w14:val="none"/>
+        </w:rPr>
+        <w:t>jobs</w:t>
+      </w:r>
+      <w:r>
+        <w:rPr>
+          <w:rFonts w:ascii="Consolas" w:eastAsia="Times New Roman" w:hAnsi="Consolas" w:cs="Times New Roman"/>
+          <w:color w:val="ABB2BF"/>
+          <w:kern w:val="0"/>
+          <w:sz w:val="21"/>
+          <w:szCs w:val="21"/>
+          <w14:ligatures w14:val="none"/>
+        </w:rPr>
+        <w:t xml:space="preserve">: </w:t>
+      </w:r>
+      <w:r>
+        <w:rPr>
+          <w:rFonts w:ascii="Consolas" w:eastAsia="Times New Roman" w:hAnsi="Consolas" w:cs="Times New Roman"/>
+          <w:color w:val="7F848E"/>
+          <w:kern w:val="0"/>
+          <w:sz w:val="21"/>
+          <w:szCs w:val="21"/>
+          <w14:ligatures w14:val="none"/>
+        </w:rPr>
+        <w:t># here defines jobs - what to do</w:t>
+      </w:r>
+    </w:p>
+    <w:p>
+      <w:pPr>
+        <w:shd w:val="clear" w:color="auto" w:fill="23272E"/>
+        <w:spacing w:after="0" w:line="285" w:lineRule="atLeast"/>
+        <w:rPr>
+          <w:rFonts w:ascii="Consolas" w:eastAsia="Times New Roman" w:hAnsi="Consolas" w:cs="Times New Roman"/>
+          <w:color w:val="ABB2BF"/>
+          <w:kern w:val="0"/>
+          <w:sz w:val="21"/>
+          <w:szCs w:val="21"/>
+          <w14:ligatures w14:val="none"/>
+        </w:rPr>
+      </w:pPr>
+      <w:r>
+        <w:rPr>
+          <w:rFonts w:ascii="Consolas" w:eastAsia="Times New Roman" w:hAnsi="Consolas" w:cs="Times New Roman"/>
+          <w:color w:val="ABB2BF"/>
+          <w:kern w:val="0"/>
+          <w:sz w:val="21"/>
+          <w:szCs w:val="21"/>
+          <w14:ligatures w14:val="none"/>
+        </w:rPr>
+        <w:t xml:space="preserve">  </w:t>
+      </w:r>
+      <w:r>
+        <w:rPr>
+          <w:rFonts w:ascii="Consolas" w:eastAsia="Times New Roman" w:hAnsi="Consolas" w:cs="Times New Roman"/>
+          <w:color w:val="E06C75"/>
+          <w:kern w:val="0"/>
+          <w:sz w:val="21"/>
+          <w:szCs w:val="21"/>
+          <w14:ligatures w14:val="none"/>
+        </w:rPr>
+        <w:t>deploy</w:t>
+      </w:r>
+      <w:r>
+        <w:rPr>
+          <w:rFonts w:ascii="Consolas" w:eastAsia="Times New Roman" w:hAnsi="Consolas" w:cs="Times New Roman"/>
+          <w:color w:val="ABB2BF"/>
+          <w:kern w:val="0"/>
+          <w:sz w:val="21"/>
+          <w:szCs w:val="21"/>
+          <w14:ligatures w14:val="none"/>
+        </w:rPr>
+        <w:t xml:space="preserve">: </w:t>
+      </w:r>
+      <w:r>
+        <w:rPr>
+          <w:rFonts w:ascii="Consolas" w:eastAsia="Times New Roman" w:hAnsi="Consolas" w:cs="Times New Roman"/>
+          <w:color w:val="7F848E"/>
+          <w:kern w:val="0"/>
+          <w:sz w:val="21"/>
+          <w:szCs w:val="21"/>
+          <w14:ligatures w14:val="none"/>
+        </w:rPr>
+        <w:t># one job is deploy</w:t>
+      </w:r>
+    </w:p>
+    <w:p>
+      <w:pPr>
+        <w:shd w:val="clear" w:color="auto" w:fill="23272E"/>
+        <w:spacing w:after="0" w:line="285" w:lineRule="atLeast"/>
+        <w:rPr>
+          <w:rFonts w:ascii="Consolas" w:eastAsia="Times New Roman" w:hAnsi="Consolas" w:cs="Times New Roman"/>
+          <w:color w:val="ABB2BF"/>
+          <w:kern w:val="0"/>
+          <w:sz w:val="21"/>
+          <w:szCs w:val="21"/>
+          <w14:ligatures w14:val="none"/>
+        </w:rPr>
+      </w:pPr>
+      <w:r>
+        <w:rPr>
+          <w:rFonts w:ascii="Consolas" w:eastAsia="Times New Roman" w:hAnsi="Consolas" w:cs="Times New Roman"/>
+          <w:color w:val="ABB2BF"/>
+          <w:kern w:val="0"/>
+          <w:sz w:val="21"/>
+          <w:szCs w:val="21"/>
+          <w14:ligatures w14:val="none"/>
+        </w:rPr>
+        <w:t xml:space="preserve">    </w:t>
+      </w:r>
+      <w:r>
+        <w:rPr>
+          <w:rFonts w:ascii="Consolas" w:eastAsia="Times New Roman" w:hAnsi="Consolas" w:cs="Times New Roman"/>
+          <w:color w:val="E06C75"/>
+          <w:kern w:val="0"/>
+          <w:sz w:val="21"/>
+          <w:szCs w:val="21"/>
+          <w14:ligatures w14:val="none"/>
+        </w:rPr>
+        <w:t>runs-on</w:t>
+      </w:r>
+      <w:r>
+        <w:rPr>
+          <w:rFonts w:ascii="Consolas" w:eastAsia="Times New Roman" w:hAnsi="Consolas" w:cs="Times New Roman"/>
+          <w:color w:val="ABB2BF"/>
+          <w:kern w:val="0"/>
+          <w:sz w:val="21"/>
+          <w:szCs w:val="21"/>
+          <w14:ligatures w14:val="none"/>
+        </w:rPr>
+        <w:t xml:space="preserve">: </w:t>
+      </w:r>
+      <w:r>
+        <w:rPr>
+          <w:rFonts w:ascii="Consolas" w:eastAsia="Times New Roman" w:hAnsi="Consolas" w:cs="Times New Roman"/>
+          <w:color w:val="98C379"/>
+          <w:kern w:val="0"/>
+          <w:sz w:val="21"/>
+          <w:szCs w:val="21"/>
+          <w14:ligatures w14:val="none"/>
+        </w:rPr>
+        <w:t>ubuntu-latest</w:t>
+      </w:r>
+      <w:r>
+        <w:rPr>
+          <w:rFonts w:ascii="Consolas" w:eastAsia="Times New Roman" w:hAnsi="Consolas" w:cs="Times New Roman"/>
+          <w:color w:val="ABB2BF"/>
+          <w:kern w:val="0"/>
+          <w:sz w:val="21"/>
+          <w:szCs w:val="21"/>
+          <w14:ligatures w14:val="none"/>
+        </w:rPr>
+        <w:t xml:space="preserve"> </w:t>
+      </w:r>
+      <w:r>
+        <w:rPr>
+          <w:rFonts w:ascii="Consolas" w:eastAsia="Times New Roman" w:hAnsi="Consolas" w:cs="Times New Roman"/>
+          <w:color w:val="7F848E"/>
+          <w:kern w:val="0"/>
+          <w:sz w:val="21"/>
+          <w:szCs w:val="21"/>
+          <w14:ligatures w14:val="none"/>
+        </w:rPr>
+        <w:t># create ubuntu machine</w:t>
+      </w:r>
+    </w:p>
+    <w:p>
+      <w:pPr>
+        <w:shd w:val="clear" w:color="auto" w:fill="23272E"/>
+        <w:spacing w:after="0" w:line="285" w:lineRule="atLeast"/>
+        <w:rPr>
+          <w:rFonts w:ascii="Consolas" w:eastAsia="Times New Roman" w:hAnsi="Consolas" w:cs="Times New Roman"/>
+          <w:color w:val="ABB2BF"/>
+          <w:kern w:val="0"/>
+          <w:sz w:val="21"/>
+          <w:szCs w:val="21"/>
+          <w14:ligatures w14:val="none"/>
+        </w:rPr>
+      </w:pPr>
+    </w:p>
+    <w:p>
+      <w:pPr>
+        <w:shd w:val="clear" w:color="auto" w:fill="23272E"/>
+        <w:spacing w:after="0" w:line="285" w:lineRule="atLeast"/>
+        <w:rPr>
+          <w:rFonts w:ascii="Consolas" w:eastAsia="Times New Roman" w:hAnsi="Consolas" w:cs="Times New Roman"/>
+          <w:color w:val="ABB2BF"/>
+          <w:kern w:val="0"/>
+          <w:sz w:val="21"/>
+          <w:szCs w:val="21"/>
+          <w14:ligatures w14:val="none"/>
+        </w:rPr>
+      </w:pPr>
+      <w:r>
+        <w:rPr>
+          <w:rFonts w:ascii="Consolas" w:eastAsia="Times New Roman" w:hAnsi="Consolas" w:cs="Times New Roman"/>
+          <w:color w:val="ABB2BF"/>
+          <w:kern w:val="0"/>
+          <w:sz w:val="21"/>
+          <w:szCs w:val="21"/>
+          <w14:ligatures w14:val="none"/>
+        </w:rPr>
+        <w:t xml:space="preserve">    </w:t>
+      </w:r>
+      <w:r>
+        <w:rPr>
+          <w:rFonts w:ascii="Consolas" w:eastAsia="Times New Roman" w:hAnsi="Consolas" w:cs="Times New Roman"/>
+          <w:color w:val="E06C75"/>
+          <w:kern w:val="0"/>
+          <w:sz w:val="21"/>
+          <w:szCs w:val="21"/>
+          <w14:ligatures w14:val="none"/>
+        </w:rPr>
+        <w:t>steps</w:t>
+      </w:r>
+      <w:r>
+        <w:rPr>
+          <w:rFonts w:ascii="Consolas" w:eastAsia="Times New Roman" w:hAnsi="Consolas" w:cs="Times New Roman"/>
+          <w:color w:val="ABB2BF"/>
+          <w:kern w:val="0"/>
+          <w:sz w:val="21"/>
+          <w:szCs w:val="21"/>
+          <w14:ligatures w14:val="none"/>
+        </w:rPr>
+        <w:t xml:space="preserve">: </w:t>
+      </w:r>
+      <w:r>
+        <w:rPr>
+          <w:rFonts w:ascii="Consolas" w:eastAsia="Times New Roman" w:hAnsi="Consolas" w:cs="Times New Roman"/>
+          <w:color w:val="7F848E"/>
+          <w:kern w:val="0"/>
+          <w:sz w:val="21"/>
+          <w:szCs w:val="21"/>
+          <w14:ligatures w14:val="none"/>
+        </w:rPr>
+        <w:t># then define steps how &amp; which sequence things done</w:t>
+      </w:r>
+    </w:p>
+    <w:p>
+      <w:pPr>
+        <w:shd w:val="clear" w:color="auto" w:fill="23272E"/>
+        <w:spacing w:after="0" w:line="285" w:lineRule="atLeast"/>
+        <w:rPr>
+          <w:rFonts w:ascii="Consolas" w:eastAsia="Times New Roman" w:hAnsi="Consolas" w:cs="Times New Roman"/>
+          <w:color w:val="ABB2BF"/>
+          <w:kern w:val="0"/>
+          <w:sz w:val="21"/>
+          <w:szCs w:val="21"/>
+          <w14:ligatures w14:val="none"/>
+        </w:rPr>
+      </w:pPr>
+      <w:r>
+        <w:rPr>
+          <w:rFonts w:ascii="Consolas" w:eastAsia="Times New Roman" w:hAnsi="Consolas" w:cs="Times New Roman"/>
+          <w:color w:val="ABB2BF"/>
+          <w:kern w:val="0"/>
+          <w:sz w:val="21"/>
+          <w:szCs w:val="21"/>
+          <w14:ligatures w14:val="none"/>
+        </w:rPr>
+        <w:t xml:space="preserve">      - </w:t>
+      </w:r>
+      <w:r>
+        <w:rPr>
+          <w:rFonts w:ascii="Consolas" w:eastAsia="Times New Roman" w:hAnsi="Consolas" w:cs="Times New Roman"/>
+          <w:color w:val="E06C75"/>
+          <w:kern w:val="0"/>
+          <w:sz w:val="21"/>
+          <w:szCs w:val="21"/>
+          <w14:ligatures w14:val="none"/>
+        </w:rPr>
+        <w:t>name</w:t>
+      </w:r>
+      <w:r>
+        <w:rPr>
+          <w:rFonts w:ascii="Consolas" w:eastAsia="Times New Roman" w:hAnsi="Consolas" w:cs="Times New Roman"/>
+          <w:color w:val="ABB2BF"/>
+          <w:kern w:val="0"/>
+          <w:sz w:val="21"/>
+          <w:szCs w:val="21"/>
+          <w14:ligatures w14:val="none"/>
+        </w:rPr>
+        <w:t xml:space="preserve">: </w:t>
+      </w:r>
+      <w:r>
+        <w:rPr>
+          <w:rFonts w:ascii="Consolas" w:eastAsia="Times New Roman" w:hAnsi="Consolas" w:cs="Times New Roman"/>
+          <w:color w:val="98C379"/>
+          <w:kern w:val="0"/>
+          <w:sz w:val="21"/>
+          <w:szCs w:val="21"/>
+          <w14:ligatures w14:val="none"/>
+        </w:rPr>
+        <w:t>checkout code</w:t>
+      </w:r>
+      <w:r>
+        <w:rPr>
+          <w:rFonts w:ascii="Consolas" w:eastAsia="Times New Roman" w:hAnsi="Consolas" w:cs="Times New Roman"/>
+          <w:color w:val="ABB2BF"/>
+          <w:kern w:val="0"/>
+          <w:sz w:val="21"/>
+          <w:szCs w:val="21"/>
+          <w14:ligatures w14:val="none"/>
+        </w:rPr>
+        <w:t xml:space="preserve"> </w:t>
+      </w:r>
+      <w:r>
+        <w:rPr>
+          <w:rFonts w:ascii="Consolas" w:eastAsia="Times New Roman" w:hAnsi="Consolas" w:cs="Times New Roman"/>
+          <w:color w:val="7F848E"/>
+          <w:kern w:val="0"/>
+          <w:sz w:val="21"/>
+          <w:szCs w:val="21"/>
+          <w14:ligatures w14:val="none"/>
+        </w:rPr>
+        <w:t>#step1 name</w:t>
+      </w:r>
+    </w:p>
+    <w:p>
+      <w:pPr>
+        <w:shd w:val="clear" w:color="auto" w:fill="23272E"/>
+        <w:spacing w:after="0" w:line="285" w:lineRule="atLeast"/>
+        <w:rPr>
+          <w:rFonts w:ascii="Consolas" w:eastAsia="Times New Roman" w:hAnsi="Consolas" w:cs="Times New Roman"/>
+          <w:color w:val="ABB2BF"/>
+          <w:kern w:val="0"/>
+          <w:sz w:val="21"/>
+          <w:szCs w:val="21"/>
+          <w14:ligatures w14:val="none"/>
+        </w:rPr>
+      </w:pPr>
+      <w:r>
+        <w:rPr>
+          <w:rFonts w:ascii="Consolas" w:eastAsia="Times New Roman" w:hAnsi="Consolas" w:cs="Times New Roman"/>
+          <w:color w:val="ABB2BF"/>
+          <w:kern w:val="0"/>
+          <w:sz w:val="21"/>
+          <w:szCs w:val="21"/>
+          <w14:ligatures w14:val="none"/>
+        </w:rPr>
+        <w:t xml:space="preserve">        </w:t>
+      </w:r>
+      <w:r>
+        <w:rPr>
+          <w:rFonts w:ascii="Consolas" w:eastAsia="Times New Roman" w:hAnsi="Consolas" w:cs="Times New Roman"/>
+          <w:color w:val="E06C75"/>
+          <w:kern w:val="0"/>
+          <w:sz w:val="21"/>
+          <w:szCs w:val="21"/>
+          <w14:ligatures w14:val="none"/>
+        </w:rPr>
+        <w:t>uses</w:t>
+      </w:r>
+      <w:r>
+        <w:rPr>
+          <w:rFonts w:ascii="Consolas" w:eastAsia="Times New Roman" w:hAnsi="Consolas" w:cs="Times New Roman"/>
+          <w:color w:val="ABB2BF"/>
+          <w:kern w:val="0"/>
+          <w:sz w:val="21"/>
+          <w:szCs w:val="21"/>
+          <w14:ligatures w14:val="none"/>
+        </w:rPr>
+        <w:t xml:space="preserve">: </w:t>
+      </w:r>
+      <w:r>
+        <w:rPr>
+          <w:rFonts w:ascii="Consolas" w:eastAsia="Times New Roman" w:hAnsi="Consolas" w:cs="Times New Roman"/>
+          <w:color w:val="98C379"/>
+          <w:kern w:val="0"/>
+          <w:sz w:val="21"/>
+          <w:szCs w:val="21"/>
+          <w14:ligatures w14:val="none"/>
+        </w:rPr>
+        <w:t>actions/checkout@v6</w:t>
+      </w:r>
+      <w:r>
+        <w:rPr>
+          <w:rFonts w:ascii="Consolas" w:eastAsia="Times New Roman" w:hAnsi="Consolas" w:cs="Times New Roman"/>
+          <w:color w:val="ABB2BF"/>
+          <w:kern w:val="0"/>
+          <w:sz w:val="21"/>
+          <w:szCs w:val="21"/>
+          <w14:ligatures w14:val="none"/>
+        </w:rPr>
+        <w:t xml:space="preserve"> </w:t>
+      </w:r>
+      <w:r>
+        <w:rPr>
+          <w:rFonts w:ascii="Consolas" w:eastAsia="Times New Roman" w:hAnsi="Consolas" w:cs="Times New Roman"/>
+          <w:color w:val="7F848E"/>
+          <w:kern w:val="0"/>
+          <w:sz w:val="21"/>
+          <w:szCs w:val="21"/>
+          <w14:ligatures w14:val="none"/>
+        </w:rPr>
+        <w:t>#github action that check code</w:t>
+      </w:r>
+    </w:p>
+    <w:p>
+      <w:pPr>
+        <w:shd w:val="clear" w:color="auto" w:fill="23272E"/>
+        <w:spacing w:after="0" w:line="285" w:lineRule="atLeast"/>
+        <w:rPr>
+          <w:rFonts w:ascii="Consolas" w:eastAsia="Times New Roman" w:hAnsi="Consolas" w:cs="Times New Roman"/>
+          <w:color w:val="ABB2BF"/>
+          <w:kern w:val="0"/>
+          <w:sz w:val="21"/>
+          <w:szCs w:val="21"/>
+          <w14:ligatures w14:val="none"/>
+        </w:rPr>
+      </w:pPr>
+    </w:p>
+    <w:p>
+      <w:pPr>
+        <w:shd w:val="clear" w:color="auto" w:fill="23272E"/>
+        <w:spacing w:after="0" w:line="285" w:lineRule="atLeast"/>
+        <w:rPr>
+          <w:rFonts w:ascii="Consolas" w:eastAsia="Times New Roman" w:hAnsi="Consolas" w:cs="Times New Roman"/>
+          <w:color w:val="ABB2BF"/>
+          <w:kern w:val="0"/>
+          <w:sz w:val="21"/>
+          <w:szCs w:val="21"/>
+          <w14:ligatures w14:val="none"/>
+        </w:rPr>
+      </w:pPr>
+      <w:r>
+        <w:rPr>
+          <w:rFonts w:ascii="Consolas" w:eastAsia="Times New Roman" w:hAnsi="Consolas" w:cs="Times New Roman"/>
+          <w:color w:val="ABB2BF"/>
+          <w:kern w:val="0"/>
+          <w:sz w:val="21"/>
+          <w:szCs w:val="21"/>
+          <w14:ligatures w14:val="none"/>
+        </w:rPr>
+        <w:t xml:space="preserve">      - </w:t>
+      </w:r>
+      <w:r>
+        <w:rPr>
+          <w:rFonts w:ascii="Consolas" w:eastAsia="Times New Roman" w:hAnsi="Consolas" w:cs="Times New Roman"/>
+          <w:color w:val="E06C75"/>
+          <w:kern w:val="0"/>
+          <w:sz w:val="21"/>
+          <w:szCs w:val="21"/>
+          <w14:ligatures w14:val="none"/>
+        </w:rPr>
+        <w:t>name</w:t>
+      </w:r>
+      <w:r>
+        <w:rPr>
+          <w:rFonts w:ascii="Consolas" w:eastAsia="Times New Roman" w:hAnsi="Consolas" w:cs="Times New Roman"/>
+          <w:color w:val="ABB2BF"/>
+          <w:kern w:val="0"/>
+          <w:sz w:val="21"/>
+          <w:szCs w:val="21"/>
+          <w14:ligatures w14:val="none"/>
+        </w:rPr>
+        <w:t xml:space="preserve">: </w:t>
+      </w:r>
+      <w:r>
+        <w:rPr>
+          <w:rFonts w:ascii="Consolas" w:eastAsia="Times New Roman" w:hAnsi="Consolas" w:cs="Times New Roman"/>
+          <w:color w:val="98C379"/>
+          <w:kern w:val="0"/>
+          <w:sz w:val="21"/>
+          <w:szCs w:val="21"/>
+          <w14:ligatures w14:val="none"/>
+        </w:rPr>
+        <w:t>Connect EC2 and Deploy</w:t>
+      </w:r>
+      <w:r>
+        <w:rPr>
+          <w:rFonts w:ascii="Consolas" w:eastAsia="Times New Roman" w:hAnsi="Consolas" w:cs="Times New Roman"/>
+          <w:color w:val="ABB2BF"/>
+          <w:kern w:val="0"/>
+          <w:sz w:val="21"/>
+          <w:szCs w:val="21"/>
+          <w14:ligatures w14:val="none"/>
+        </w:rPr>
+        <w:t xml:space="preserve"> </w:t>
+      </w:r>
+      <w:r>
+        <w:rPr>
+          <w:rFonts w:ascii="Consolas" w:eastAsia="Times New Roman" w:hAnsi="Consolas" w:cs="Times New Roman"/>
+          <w:color w:val="7F848E"/>
+          <w:kern w:val="0"/>
+          <w:sz w:val="21"/>
+          <w:szCs w:val="21"/>
+          <w14:ligatures w14:val="none"/>
+        </w:rPr>
+        <w:t>#step2 name</w:t>
+      </w:r>
+    </w:p>
+    <w:p>
+      <w:pPr>
+        <w:shd w:val="clear" w:color="auto" w:fill="23272E"/>
+        <w:spacing w:after="0" w:line="285" w:lineRule="atLeast"/>
+        <w:rPr>
+          <w:rFonts w:ascii="Consolas" w:eastAsia="Times New Roman" w:hAnsi="Consolas" w:cs="Times New Roman"/>
+          <w:color w:val="ABB2BF"/>
+          <w:kern w:val="0"/>
+          <w:sz w:val="21"/>
+          <w:szCs w:val="21"/>
+          <w14:ligatures w14:val="none"/>
+        </w:rPr>
+      </w:pPr>
+      <w:r>
+        <w:rPr>
+          <w:rFonts w:ascii="Consolas" w:eastAsia="Times New Roman" w:hAnsi="Consolas" w:cs="Times New Roman"/>
+          <w:color w:val="ABB2BF"/>
+          <w:kern w:val="0"/>
+          <w:sz w:val="21"/>
+          <w:szCs w:val="21"/>
+          <w14:ligatures w14:val="none"/>
+        </w:rPr>
+        <w:t xml:space="preserve">        </w:t>
+      </w:r>
+      <w:r>
+        <w:rPr>
+          <w:rFonts w:ascii="Consolas" w:eastAsia="Times New Roman" w:hAnsi="Consolas" w:cs="Times New Roman"/>
+          <w:color w:val="E06C75"/>
+          <w:kern w:val="0"/>
+          <w:sz w:val="21"/>
+          <w:szCs w:val="21"/>
+          <w14:ligatures w14:val="none"/>
+        </w:rPr>
+        <w:t>uses</w:t>
+      </w:r>
+      <w:r>
+        <w:rPr>
+          <w:rFonts w:ascii="Consolas" w:eastAsia="Times New Roman" w:hAnsi="Consolas" w:cs="Times New Roman"/>
+          <w:color w:val="ABB2BF"/>
+          <w:kern w:val="0"/>
+          <w:sz w:val="21"/>
+          <w:szCs w:val="21"/>
+          <w14:ligatures w14:val="none"/>
+        </w:rPr>
+        <w:t xml:space="preserve">: </w:t>
+      </w:r>
+      <w:r>
+        <w:rPr>
+          <w:rFonts w:ascii="Consolas" w:eastAsia="Times New Roman" w:hAnsi="Consolas" w:cs="Times New Roman"/>
+          <w:color w:val="98C379"/>
+          <w:kern w:val="0"/>
+          <w:sz w:val="21"/>
+          <w:szCs w:val="21"/>
+          <w14:ligatures w14:val="none"/>
+        </w:rPr>
+        <w:t>appleboy/ssh-action@v1</w:t>
+      </w:r>
+    </w:p>
+    <w:p>
+      <w:pPr>
+        <w:shd w:val="clear" w:color="auto" w:fill="23272E"/>
+        <w:spacing w:after="0" w:line="285" w:lineRule="atLeast"/>
+        <w:rPr>
+          <w:rFonts w:ascii="Consolas" w:eastAsia="Times New Roman" w:hAnsi="Consolas" w:cs="Times New Roman"/>
+          <w:color w:val="ABB2BF"/>
+          <w:kern w:val="0"/>
+          <w:sz w:val="21"/>
+          <w:szCs w:val="21"/>
+          <w14:ligatures w14:val="none"/>
+        </w:rPr>
+      </w:pPr>
+    </w:p>
+    <w:p>
+      <w:pPr>
+        <w:shd w:val="clear" w:color="auto" w:fill="23272E"/>
+        <w:spacing w:after="0" w:line="285" w:lineRule="atLeast"/>
+        <w:rPr>
+          <w:rFonts w:ascii="Consolas" w:eastAsia="Times New Roman" w:hAnsi="Consolas" w:cs="Times New Roman"/>
+          <w:color w:val="ABB2BF"/>
+          <w:kern w:val="0"/>
+          <w:sz w:val="21"/>
+          <w:szCs w:val="21"/>
+          <w14:ligatures w14:val="none"/>
+        </w:rPr>
+      </w:pPr>
+      <w:r>
+        <w:rPr>
+          <w:rFonts w:ascii="Consolas" w:eastAsia="Times New Roman" w:hAnsi="Consolas" w:cs="Times New Roman"/>
+          <w:color w:val="ABB2BF"/>
+          <w:kern w:val="0"/>
+          <w:sz w:val="21"/>
+          <w:szCs w:val="21"/>
+          <w14:ligatures w14:val="none"/>
+        </w:rPr>
+        <w:t xml:space="preserve">        </w:t>
+      </w:r>
+      <w:r>
+        <w:rPr>
+          <w:rFonts w:ascii="Consolas" w:eastAsia="Times New Roman" w:hAnsi="Consolas" w:cs="Times New Roman"/>
+          <w:color w:val="E06C75"/>
+          <w:kern w:val="0"/>
+          <w:sz w:val="21"/>
+          <w:szCs w:val="21"/>
+          <w14:ligatures w14:val="none"/>
+        </w:rPr>
+        <w:t>with</w:t>
+      </w:r>
+      <w:r>
+        <w:rPr>
+          <w:rFonts w:ascii="Consolas" w:eastAsia="Times New Roman" w:hAnsi="Consolas" w:cs="Times New Roman"/>
+          <w:color w:val="ABB2BF"/>
+          <w:kern w:val="0"/>
+          <w:sz w:val="21"/>
+          <w:szCs w:val="21"/>
+          <w14:ligatures w14:val="none"/>
+        </w:rPr>
+        <w:t>:</w:t>
+      </w:r>
+    </w:p>
+    <w:p>
+      <w:pPr>
+        <w:shd w:val="clear" w:color="auto" w:fill="23272E"/>
+        <w:spacing w:after="0" w:line="285" w:lineRule="atLeast"/>
+        <w:rPr>
+          <w:rFonts w:ascii="Consolas" w:eastAsia="Times New Roman" w:hAnsi="Consolas" w:cs="Times New Roman"/>
+          <w:color w:val="ABB2BF"/>
+          <w:kern w:val="0"/>
+          <w:sz w:val="21"/>
+          <w:szCs w:val="21"/>
+          <w14:ligatures w14:val="none"/>
+        </w:rPr>
+      </w:pPr>
+      <w:r>
+        <w:rPr>
+          <w:rFonts w:ascii="Consolas" w:eastAsia="Times New Roman" w:hAnsi="Consolas" w:cs="Times New Roman"/>
+          <w:color w:val="ABB2BF"/>
+          <w:kern w:val="0"/>
+          <w:sz w:val="21"/>
+          <w:szCs w:val="21"/>
+          <w14:ligatures w14:val="none"/>
+        </w:rPr>
+        <w:t xml:space="preserve">          </w:t>
+      </w:r>
+      <w:r>
+        <w:rPr>
+          <w:rFonts w:ascii="Consolas" w:eastAsia="Times New Roman" w:hAnsi="Consolas" w:cs="Times New Roman"/>
+          <w:color w:val="E06C75"/>
+          <w:kern w:val="0"/>
+          <w:sz w:val="21"/>
+          <w:szCs w:val="21"/>
+          <w14:ligatures w14:val="none"/>
+        </w:rPr>
+        <w:t>host</w:t>
+      </w:r>
+      <w:r>
+        <w:rPr>
+          <w:rFonts w:ascii="Consolas" w:eastAsia="Times New Roman" w:hAnsi="Consolas" w:cs="Times New Roman"/>
+          <w:color w:val="ABB2BF"/>
+          <w:kern w:val="0"/>
+          <w:sz w:val="21"/>
+          <w:szCs w:val="21"/>
+          <w14:ligatures w14:val="none"/>
+        </w:rPr>
+        <w:t>: ${{</w:t>
+      </w:r>
+      <w:r>
+        <w:rPr>
+          <w:rFonts w:ascii="Consolas" w:eastAsia="Times New Roman" w:hAnsi="Consolas" w:cs="Times New Roman"/>
+          <w:color w:val="E06C75"/>
+          <w:kern w:val="0"/>
+          <w:sz w:val="21"/>
+          <w:szCs w:val="21"/>
+          <w14:ligatures w14:val="none"/>
+        </w:rPr>
+        <w:t>secrets</w:t>
+      </w:r>
+      <w:r>
+        <w:rPr>
+          <w:rFonts w:ascii="Consolas" w:eastAsia="Times New Roman" w:hAnsi="Consolas" w:cs="Times New Roman"/>
+          <w:color w:val="ABB2BF"/>
+          <w:kern w:val="0"/>
+          <w:sz w:val="21"/>
+          <w:szCs w:val="21"/>
+          <w14:ligatures w14:val="none"/>
+        </w:rPr>
+        <w:t>.</w:t>
+      </w:r>
+      <w:r>
+        <w:rPr>
+          <w:rFonts w:ascii="Consolas" w:eastAsia="Times New Roman" w:hAnsi="Consolas" w:cs="Times New Roman"/>
+          <w:color w:val="E06C75"/>
+          <w:kern w:val="0"/>
+          <w:sz w:val="21"/>
+          <w:szCs w:val="21"/>
+          <w14:ligatures w14:val="none"/>
+        </w:rPr>
+        <w:t>SSH_HOST</w:t>
+      </w:r>
+      <w:r>
+        <w:rPr>
+          <w:rFonts w:ascii="Consolas" w:eastAsia="Times New Roman" w:hAnsi="Consolas" w:cs="Times New Roman"/>
+          <w:color w:val="ABB2BF"/>
+          <w:kern w:val="0"/>
+          <w:sz w:val="21"/>
+          <w:szCs w:val="21"/>
+          <w14:ligatures w14:val="none"/>
+        </w:rPr>
+        <w:t xml:space="preserve">}} </w:t>
+      </w:r>
+      <w:r>
+        <w:rPr>
+          <w:rFonts w:ascii="Consolas" w:eastAsia="Times New Roman" w:hAnsi="Consolas" w:cs="Times New Roman"/>
+          <w:color w:val="7F848E"/>
+          <w:kern w:val="0"/>
+          <w:sz w:val="21"/>
+          <w:szCs w:val="21"/>
+          <w14:ligatures w14:val="none"/>
+        </w:rPr>
+        <w:t># get secret from github secret</w:t>
+      </w:r>
+    </w:p>
+    <w:p>
+      <w:pPr>
+        <w:shd w:val="clear" w:color="auto" w:fill="23272E"/>
+        <w:spacing w:after="0" w:line="285" w:lineRule="atLeast"/>
+        <w:rPr>
+          <w:rFonts w:ascii="Consolas" w:eastAsia="Times New Roman" w:hAnsi="Consolas" w:cs="Times New Roman"/>
+          <w:color w:val="ABB2BF"/>
+          <w:kern w:val="0"/>
+          <w:sz w:val="21"/>
+          <w:szCs w:val="21"/>
+          <w14:ligatures w14:val="none"/>
+        </w:rPr>
+      </w:pPr>
+      <w:r>
+        <w:rPr>
+          <w:rFonts w:ascii="Consolas" w:eastAsia="Times New Roman" w:hAnsi="Consolas" w:cs="Times New Roman"/>
+          <w:color w:val="ABB2BF"/>
+          <w:kern w:val="0"/>
+          <w:sz w:val="21"/>
+          <w:szCs w:val="21"/>
+          <w14:ligatures w14:val="none"/>
+        </w:rPr>
+        <w:t xml:space="preserve">          </w:t>
+      </w:r>
+      <w:r>
+        <w:rPr>
+          <w:rFonts w:ascii="Consolas" w:eastAsia="Times New Roman" w:hAnsi="Consolas" w:cs="Times New Roman"/>
+          <w:color w:val="7F848E"/>
+          <w:kern w:val="0"/>
+          <w:sz w:val="21"/>
+          <w:szCs w:val="21"/>
+          <w14:ligatures w14:val="none"/>
+        </w:rPr>
+        <w:t xml:space="preserve"># </w:t>
+      </w:r>
+      <w:r>
+        <w:rPr>
+          <w:rFonts w:ascii="Consolas" w:eastAsia="Times New Roman" w:hAnsi="Consolas" w:cs="Times New Roman"/>
+          <w:color w:val="7F848E"/>
+          <w:kern w:val="0"/>
+          <w:sz w:val="21"/>
+          <w:szCs w:val="21"/>
+          <w14:ligatures w14:val="none"/>
+        </w:rPr>
+        <w:t xml:space="preserve">add secret in github: </w:t>
+      </w:r>
+      <w:r>
+        <w:rPr>
+          <w:rFonts w:ascii="Consolas" w:eastAsia="Times New Roman" w:hAnsi="Consolas" w:cs="Times New Roman"/>
+          <w:color w:val="7F848E"/>
+          <w:kern w:val="0"/>
+          <w:sz w:val="21"/>
+          <w:szCs w:val="21"/>
+          <w14:ligatures w14:val="none"/>
+        </w:rPr>
+        <w:t>repo - settings - secretsAndVariables - Actions - new repo secrets - give name &amp; secret (elastic ip) &amp; click on add secret.</w:t>
+      </w:r>
+    </w:p>
+    <w:p>
+      <w:pPr>
+        <w:shd w:val="clear" w:color="auto" w:fill="23272E"/>
+        <w:spacing w:after="0" w:line="285" w:lineRule="atLeast"/>
+        <w:rPr>
+          <w:rFonts w:ascii="Consolas" w:eastAsia="Times New Roman" w:hAnsi="Consolas" w:cs="Times New Roman"/>
+          <w:color w:val="ABB2BF"/>
+          <w:kern w:val="0"/>
+          <w:sz w:val="21"/>
+          <w:szCs w:val="21"/>
+          <w14:ligatures w14:val="none"/>
+        </w:rPr>
+      </w:pPr>
+      <w:r>
+        <w:rPr>
+          <w:rFonts w:ascii="Consolas" w:eastAsia="Times New Roman" w:hAnsi="Consolas" w:cs="Times New Roman"/>
+          <w:color w:val="ABB2BF"/>
+          <w:kern w:val="0"/>
+          <w:sz w:val="21"/>
+          <w:szCs w:val="21"/>
+          <w14:ligatures w14:val="none"/>
+        </w:rPr>
+        <w:t xml:space="preserve">          </w:t>
+      </w:r>
+      <w:r>
+        <w:rPr>
+          <w:rFonts w:ascii="Consolas" w:eastAsia="Times New Roman" w:hAnsi="Consolas" w:cs="Times New Roman"/>
+          <w:color w:val="E06C75"/>
+          <w:kern w:val="0"/>
+          <w:sz w:val="21"/>
+          <w:szCs w:val="21"/>
+          <w14:ligatures w14:val="none"/>
+        </w:rPr>
+        <w:t>username</w:t>
+      </w:r>
+      <w:r>
+        <w:rPr>
+          <w:rFonts w:ascii="Consolas" w:eastAsia="Times New Roman" w:hAnsi="Consolas" w:cs="Times New Roman"/>
+          <w:color w:val="ABB2BF"/>
+          <w:kern w:val="0"/>
+          <w:sz w:val="21"/>
+          <w:szCs w:val="21"/>
+          <w14:ligatures w14:val="none"/>
+        </w:rPr>
+        <w:t xml:space="preserve">: </w:t>
+      </w:r>
+      <w:r>
+        <w:rPr>
+          <w:rFonts w:ascii="Consolas" w:eastAsia="Times New Roman" w:hAnsi="Consolas" w:cs="Times New Roman"/>
+          <w:color w:val="98C379"/>
+          <w:kern w:val="0"/>
+          <w:sz w:val="21"/>
+          <w:szCs w:val="21"/>
+          <w14:ligatures w14:val="none"/>
+        </w:rPr>
+        <w:t>ubuntu</w:t>
+      </w:r>
+    </w:p>
+    <w:p>
+      <w:pPr>
+        <w:shd w:val="clear" w:color="auto" w:fill="23272E"/>
+        <w:spacing w:after="0" w:line="285" w:lineRule="atLeast"/>
+        <w:rPr>
+          <w:rFonts w:ascii="Consolas" w:eastAsia="Times New Roman" w:hAnsi="Consolas" w:cs="Times New Roman"/>
+          <w:color w:val="ABB2BF"/>
+          <w:kern w:val="0"/>
+          <w:sz w:val="21"/>
+          <w:szCs w:val="21"/>
+          <w14:ligatures w14:val="none"/>
+        </w:rPr>
+      </w:pPr>
+      <w:r>
+        <w:rPr>
+          <w:rFonts w:ascii="Consolas" w:eastAsia="Times New Roman" w:hAnsi="Consolas" w:cs="Times New Roman"/>
+          <w:color w:val="ABB2BF"/>
+          <w:kern w:val="0"/>
+          <w:sz w:val="21"/>
+          <w:szCs w:val="21"/>
+          <w14:ligatures w14:val="none"/>
+        </w:rPr>
+        <w:t xml:space="preserve">          </w:t>
+      </w:r>
+      <w:r>
+        <w:rPr>
+          <w:rFonts w:ascii="Consolas" w:eastAsia="Times New Roman" w:hAnsi="Consolas" w:cs="Times New Roman"/>
+          <w:color w:val="E06C75"/>
+          <w:kern w:val="0"/>
+          <w:sz w:val="21"/>
+          <w:szCs w:val="21"/>
+          <w14:ligatures w14:val="none"/>
+        </w:rPr>
+        <w:t>key</w:t>
+      </w:r>
+      <w:r>
+        <w:rPr>
+          <w:rFonts w:ascii="Consolas" w:eastAsia="Times New Roman" w:hAnsi="Consolas" w:cs="Times New Roman"/>
+          <w:color w:val="ABB2BF"/>
+          <w:kern w:val="0"/>
+          <w:sz w:val="21"/>
+          <w:szCs w:val="21"/>
+          <w14:ligatures w14:val="none"/>
+        </w:rPr>
+        <w:t xml:space="preserve">: ${{ </w:t>
+      </w:r>
+      <w:r>
+        <w:rPr>
+          <w:rFonts w:ascii="Consolas" w:eastAsia="Times New Roman" w:hAnsi="Consolas" w:cs="Times New Roman"/>
+          <w:color w:val="E06C75"/>
+          <w:kern w:val="0"/>
+          <w:sz w:val="21"/>
+          <w:szCs w:val="21"/>
+          <w14:ligatures w14:val="none"/>
+        </w:rPr>
+        <w:t>secrets</w:t>
+      </w:r>
+      <w:r>
+        <w:rPr>
+          <w:rFonts w:ascii="Consolas" w:eastAsia="Times New Roman" w:hAnsi="Consolas" w:cs="Times New Roman"/>
+          <w:color w:val="ABB2BF"/>
+          <w:kern w:val="0"/>
+          <w:sz w:val="21"/>
+          <w:szCs w:val="21"/>
+          <w14:ligatures w14:val="none"/>
+        </w:rPr>
+        <w:t>.</w:t>
+      </w:r>
+      <w:r>
+        <w:rPr>
+          <w:rFonts w:ascii="Consolas" w:eastAsia="Times New Roman" w:hAnsi="Consolas" w:cs="Times New Roman"/>
+          <w:color w:val="E06C75"/>
+          <w:kern w:val="0"/>
+          <w:sz w:val="21"/>
+          <w:szCs w:val="21"/>
+          <w14:ligatures w14:val="none"/>
+        </w:rPr>
+        <w:t>SSH_KEY</w:t>
+      </w:r>
+      <w:r>
+        <w:rPr>
+          <w:rFonts w:ascii="Consolas" w:eastAsia="Times New Roman" w:hAnsi="Consolas" w:cs="Times New Roman"/>
+          <w:color w:val="ABB2BF"/>
+          <w:kern w:val="0"/>
+          <w:sz w:val="21"/>
+          <w:szCs w:val="21"/>
+          <w14:ligatures w14:val="none"/>
+        </w:rPr>
+        <w:t xml:space="preserve"> }} </w:t>
+      </w:r>
+      <w:r>
+        <w:rPr>
+          <w:rFonts w:ascii="Consolas" w:eastAsia="Times New Roman" w:hAnsi="Consolas" w:cs="Times New Roman"/>
+          <w:color w:val="7F848E"/>
+          <w:kern w:val="0"/>
+          <w:sz w:val="21"/>
+          <w:szCs w:val="21"/>
+          <w14:ligatures w14:val="none"/>
+        </w:rPr>
+        <w:t># cat level5pk.pem &amp; copy all its content &amp; paste it in SSH_KEY name github secret.</w:t>
+      </w:r>
+    </w:p>
+    <w:p>
+      <w:pPr>
+        <w:shd w:val="clear" w:color="auto" w:fill="23272E"/>
+        <w:spacing w:after="0" w:line="285" w:lineRule="atLeast"/>
+        <w:rPr>
+          <w:rFonts w:ascii="Consolas" w:eastAsia="Times New Roman" w:hAnsi="Consolas" w:cs="Times New Roman"/>
+          <w:color w:val="ABB2BF"/>
+          <w:kern w:val="0"/>
+          <w:sz w:val="21"/>
+          <w:szCs w:val="21"/>
+          <w14:ligatures w14:val="none"/>
+        </w:rPr>
+      </w:pPr>
+    </w:p>
+    <w:p>
+      <w:pPr>
+        <w:shd w:val="clear" w:color="auto" w:fill="23272E"/>
+        <w:spacing w:after="0" w:line="285" w:lineRule="atLeast"/>
+        <w:rPr>
+          <w:rFonts w:ascii="Consolas" w:eastAsia="Times New Roman" w:hAnsi="Consolas" w:cs="Times New Roman"/>
+          <w:color w:val="ABB2BF"/>
+          <w:kern w:val="0"/>
+          <w:sz w:val="21"/>
+          <w:szCs w:val="21"/>
+          <w14:ligatures w14:val="none"/>
+        </w:rPr>
+      </w:pPr>
+      <w:r>
+        <w:rPr>
+          <w:rFonts w:ascii="Consolas" w:eastAsia="Times New Roman" w:hAnsi="Consolas" w:cs="Times New Roman"/>
+          <w:color w:val="ABB2BF"/>
+          <w:kern w:val="0"/>
+          <w:sz w:val="21"/>
+          <w:szCs w:val="21"/>
+          <w14:ligatures w14:val="none"/>
+        </w:rPr>
+        <w:t xml:space="preserve">          </w:t>
+      </w:r>
+      <w:r>
+        <w:rPr>
+          <w:rFonts w:ascii="Consolas" w:eastAsia="Times New Roman" w:hAnsi="Consolas" w:cs="Times New Roman"/>
+          <w:color w:val="E06C75"/>
+          <w:kern w:val="0"/>
+          <w:sz w:val="21"/>
+          <w:szCs w:val="21"/>
+          <w14:ligatures w14:val="none"/>
+        </w:rPr>
+        <w:t>script</w:t>
+      </w:r>
+      <w:r>
+        <w:rPr>
+          <w:rFonts w:ascii="Consolas" w:eastAsia="Times New Roman" w:hAnsi="Consolas" w:cs="Times New Roman"/>
+          <w:color w:val="ABB2BF"/>
+          <w:kern w:val="0"/>
+          <w:sz w:val="21"/>
+          <w:szCs w:val="21"/>
+          <w14:ligatures w14:val="none"/>
+        </w:rPr>
+        <w:t xml:space="preserve">: </w:t>
+      </w:r>
+      <w:r>
+        <w:rPr>
+          <w:rFonts w:ascii="Consolas" w:eastAsia="Times New Roman" w:hAnsi="Consolas" w:cs="Times New Roman"/>
+          <w:color w:val="C678DD"/>
+          <w:kern w:val="0"/>
+          <w:sz w:val="21"/>
+          <w:szCs w:val="21"/>
+          <w14:ligatures w14:val="none"/>
+        </w:rPr>
+        <w:t>|</w:t>
+      </w:r>
+    </w:p>
+    <w:p>
+      <w:pPr>
+        <w:shd w:val="clear" w:color="auto" w:fill="23272E"/>
+        <w:spacing w:after="0" w:line="285" w:lineRule="atLeast"/>
+        <w:rPr>
+          <w:rFonts w:ascii="Consolas" w:eastAsia="Times New Roman" w:hAnsi="Consolas" w:cs="Times New Roman"/>
+          <w:color w:val="ABB2BF"/>
+          <w:kern w:val="0"/>
+          <w:sz w:val="21"/>
+          <w:szCs w:val="21"/>
+          <w14:ligatures w14:val="none"/>
+        </w:rPr>
+      </w:pPr>
+      <w:r>
+        <w:rPr>
+          <w:rFonts w:ascii="Consolas" w:eastAsia="Times New Roman" w:hAnsi="Consolas" w:cs="Times New Roman"/>
+          <w:color w:val="98C379"/>
+          <w:kern w:val="0"/>
+          <w:sz w:val="21"/>
+          <w:szCs w:val="21"/>
+          <w14:ligatures w14:val="none"/>
+        </w:rPr>
+        <w:t>            cd ~/</w:t>
+      </w:r>
+      <w:r>
+        <w:rPr>
+          <w:rFonts w:ascii="Consolas" w:eastAsia="Times New Roman" w:hAnsi="Consolas" w:cs="Times New Roman"/>
+          <w:color w:val="98C379"/>
+          <w:kern w:val="0"/>
+          <w:sz w:val="21"/>
+          <w:szCs w:val="21"/>
+          <w14:ligatures w14:val="none"/>
+        </w:rPr>
+        <w:t>aws-deployement</w:t>
+      </w:r>
+    </w:p>
+    <w:p>
+      <w:pPr>
+        <w:shd w:val="clear" w:color="auto" w:fill="23272E"/>
+        <w:spacing w:after="0" w:line="285" w:lineRule="atLeast"/>
+        <w:rPr>
+          <w:rFonts w:ascii="Consolas" w:eastAsia="Times New Roman" w:hAnsi="Consolas" w:cs="Times New Roman"/>
+          <w:color w:val="ABB2BF"/>
+          <w:kern w:val="0"/>
+          <w:sz w:val="21"/>
+          <w:szCs w:val="21"/>
+          <w14:ligatures w14:val="none"/>
+        </w:rPr>
+      </w:pPr>
+      <w:r>
+        <w:rPr>
+          <w:rFonts w:ascii="Consolas" w:eastAsia="Times New Roman" w:hAnsi="Consolas" w:cs="Times New Roman"/>
+          <w:color w:val="98C379"/>
+          <w:kern w:val="0"/>
+          <w:sz w:val="21"/>
+          <w:szCs w:val="21"/>
+          <w14:ligatures w14:val="none"/>
+        </w:rPr>
+        <w:t>            git pull</w:t>
+      </w:r>
+    </w:p>
+    <w:p>
+      <w:pPr>
+        <w:shd w:val="clear" w:color="auto" w:fill="23272E"/>
+        <w:spacing w:after="0" w:line="285" w:lineRule="atLeast"/>
+        <w:rPr>
+          <w:rFonts w:ascii="Consolas" w:eastAsia="Times New Roman" w:hAnsi="Consolas" w:cs="Times New Roman"/>
+          <w:color w:val="ABB2BF"/>
+          <w:kern w:val="0"/>
+          <w:sz w:val="21"/>
+          <w:szCs w:val="21"/>
+          <w14:ligatures w14:val="none"/>
+        </w:rPr>
+      </w:pPr>
+      <w:r>
+        <w:rPr>
+          <w:rFonts w:ascii="Consolas" w:eastAsia="Times New Roman" w:hAnsi="Consolas" w:cs="Times New Roman"/>
+          <w:color w:val="98C379"/>
+          <w:kern w:val="0"/>
+          <w:sz w:val="21"/>
+          <w:szCs w:val="21"/>
+          <w14:ligatures w14:val="none"/>
+        </w:rPr>
+        <w:t xml:space="preserve">            </w:t>
+      </w:r>
+      <w:r>
+        <w:rPr>
+          <w:rFonts w:ascii="Consolas" w:eastAsia="Times New Roman" w:hAnsi="Consolas" w:cs="Times New Roman"/>
+          <w:color w:val="98C379"/>
+          <w:kern w:val="0"/>
+          <w:sz w:val="21"/>
+          <w:szCs w:val="21"/>
+          <w14:ligatures w14:val="none"/>
+        </w:rPr>
+        <w:t xml:space="preserve">sudo </w:t>
+      </w:r>
+      <w:r>
+        <w:rPr>
+          <w:rFonts w:ascii="Consolas" w:eastAsia="Times New Roman" w:hAnsi="Consolas" w:cs="Times New Roman"/>
+          <w:color w:val="98C379"/>
+          <w:kern w:val="0"/>
+          <w:sz w:val="21"/>
+          <w:szCs w:val="21"/>
+          <w14:ligatures w14:val="none"/>
+        </w:rPr>
+        <w:t>docker compose down</w:t>
+      </w:r>
+    </w:p>
+    <w:p>
+      <w:pPr>
+        <w:shd w:val="clear" w:color="auto" w:fill="23272E"/>
+        <w:spacing w:after="0" w:line="285" w:lineRule="atLeast"/>
+        <w:rPr>
+          <w:rFonts w:ascii="Consolas" w:eastAsia="Times New Roman" w:hAnsi="Consolas" w:cs="Times New Roman"/>
+          <w:color w:val="ABB2BF"/>
+          <w:kern w:val="0"/>
+          <w:sz w:val="21"/>
+          <w:szCs w:val="21"/>
+          <w14:ligatures w14:val="none"/>
+        </w:rPr>
+      </w:pPr>
+      <w:r>
+        <w:rPr>
+          <w:rFonts w:ascii="Consolas" w:eastAsia="Times New Roman" w:hAnsi="Consolas" w:cs="Times New Roman"/>
+          <w:color w:val="98C379"/>
+          <w:kern w:val="0"/>
+          <w:sz w:val="21"/>
+          <w:szCs w:val="21"/>
+          <w14:ligatures w14:val="none"/>
+        </w:rPr>
+        <w:t xml:space="preserve">            </w:t>
+      </w:r>
+      <w:r>
+        <w:rPr>
+          <w:rFonts w:ascii="Consolas" w:eastAsia="Times New Roman" w:hAnsi="Consolas" w:cs="Times New Roman"/>
+          <w:color w:val="98C379"/>
+          <w:kern w:val="0"/>
+          <w:sz w:val="21"/>
+          <w:szCs w:val="21"/>
+          <w14:ligatures w14:val="none"/>
+        </w:rPr>
+        <w:t xml:space="preserve">sudo </w:t>
+      </w:r>
+      <w:r>
+        <w:rPr>
+          <w:rFonts w:ascii="Consolas" w:eastAsia="Times New Roman" w:hAnsi="Consolas" w:cs="Times New Roman"/>
+          <w:color w:val="98C379"/>
+          <w:kern w:val="0"/>
+          <w:sz w:val="21"/>
+          <w:szCs w:val="21"/>
+          <w14:ligatures w14:val="none"/>
+        </w:rPr>
+        <w:t>docker compose up --build -d</w:t>
+      </w:r>
+    </w:p>
+    <w:p>
+      <w:pPr>
+        <w:pStyle w:val="ListParagraph"/>
+        <w:spacing w:after="0" w:line="285" w:lineRule="atLeast"/>
+        <w:rPr>
+          <w:rFonts w:ascii="Consolas" w:eastAsia="Times New Roman" w:hAnsi="Consolas" w:cs="Times New Roman"/>
+          <w:kern w:val="0"/>
+          <w:sz w:val="21"/>
+          <w:szCs w:val="21"/>
+          <w14:ligatures w14:val="none"/>
+        </w:rPr>
+      </w:pPr>
+      <w:r>
+        <w:rPr>
+          <w:rFonts w:ascii="Consolas" w:eastAsia="Times New Roman" w:hAnsi="Consolas" w:cs="Times New Roman"/>
+          <w:kern w:val="0"/>
+          <w:sz w:val="21"/>
+          <w:szCs w:val="21"/>
+          <w14:ligatures w14:val="none"/>
+        </w:rPr>
+        <w:t xml:space="preserve">now if you push new changes it auto </w:t>
+      </w:r>
+      <w:r>
+        <w:rPr>
+          <w:rFonts w:ascii="Consolas" w:eastAsia="Times New Roman" w:hAnsi="Consolas" w:cs="Times New Roman"/>
+          <w:kern w:val="0"/>
+          <w:sz w:val="21"/>
+          <w:szCs w:val="21"/>
+          <w14:ligatures w14:val="none"/>
+        </w:rPr>
+        <w:t>reflect</w:t>
+      </w:r>
+      <w:r>
+        <w:rPr>
+          <w:rFonts w:ascii="Consolas" w:eastAsia="Times New Roman" w:hAnsi="Consolas" w:cs="Times New Roman"/>
+          <w:kern w:val="0"/>
+          <w:sz w:val="21"/>
+          <w:szCs w:val="21"/>
+          <w14:ligatures w14:val="none"/>
+        </w:rPr>
+        <w:t xml:space="preserve"> in deployment.</w:t>
+      </w:r>
     </w:p>
     <w:p>
       <w:pPr>

</xml_diff>